<commit_message>
nmv 23 07 2026
</commit_message>
<xml_diff>
--- a/TS Jatai Ghanam Project/TS 2.2/TS 2.2 Ghanam Malayalam Corrections.docx
+++ b/TS Jatai Ghanam Project/TS 2.2/TS 2.2 Ghanam Malayalam Corrections.docx
@@ -1,7 +1,341 @@
 
 <file path=word/document.xml><?xml version="1.0" encoding="utf-8"?>
-<w:document xmlns:wpc="http://schemas.microsoft.com/office/word/2010/wordprocessingCanvas" xmlns:cx="http://schemas.microsoft.com/office/drawing/2014/chartex" xmlns:cx1="http://schemas.microsoft.com/office/drawing/2015/9/8/chartex" xmlns:cx2="http://schemas.microsoft.com/office/drawing/2015/10/21/chartex" xmlns:cx3="http://schemas.microsoft.com/office/drawing/2016/5/9/chartex" xmlns:cx4="http://schemas.microsoft.com/office/drawing/2016/5/10/chartex" xmlns:cx5="http://schemas.microsoft.com/office/drawing/2016/5/11/chartex" xmlns:cx6="http://schemas.microsoft.com/office/drawing/2016/5/12/chartex" xmlns:cx7="http://schemas.microsoft.com/office/drawing/2016/5/13/chartex" xmlns:cx8="http://schemas.microsoft.com/office/drawing/2016/5/14/chartex" xmlns:mc="http://schemas.openxmlformats.org/markup-compatibility/2006" xmlns:aink="http://schemas.microsoft.com/office/drawing/2016/ink" xmlns:am3d="http://schemas.microsoft.com/office/drawing/2017/model3d" xmlns:o="urn:schemas-microsoft-com:office:office" xmlns:oel="http://schemas.microsoft.com/office/2019/extlst" xmlns:r="http://schemas.openxmlformats.org/officeDocument/2006/relationships" xmlns:m="http://schemas.openxmlformats.org/officeDocument/2006/math" xmlns:v="urn:schemas-microsoft-com:vml" xmlns:wp14="http://schemas.microsoft.com/office/word/2010/wordprocessingDrawing" xmlns:wp="http://schemas.openxmlformats.org/drawingml/2006/wordprocessingDrawing" xmlns:w10="urn:schemas-microsoft-com:office:word" xmlns:w="http://schemas.openxmlformats.org/wordprocessingml/2006/main" xmlns:w14="http://schemas.microsoft.com/office/word/2010/wordml" xmlns:w15="http://schemas.microsoft.com/office/word/2012/wordml" xmlns:w16cex="http://schemas.microsoft.com/office/word/2018/wordml/cex" xmlns:w16cid="http://schemas.microsoft.com/office/word/2016/wordml/cid" xmlns:w16="http://schemas.microsoft.com/office/word/2018/wordml" xmlns:w16sdtdh="http://schemas.microsoft.com/office/word/2020/wordml/sdtdatahash" xmlns:w16se="http://schemas.microsoft.com/office/word/2015/wordml/symex" xmlns:wpg="http://schemas.microsoft.com/office/word/2010/wordprocessingGroup" xmlns:wpi="http://schemas.microsoft.com/office/word/2010/wordprocessingInk" xmlns:wne="http://schemas.microsoft.com/office/word/2006/wordml" xmlns:wps="http://schemas.microsoft.com/office/word/2010/wordprocessingShape" mc:Ignorable="w14 w15 w16se w16cid w16 w16cex w16sdtdh wp14">
+<w:document xmlns:wpc="http://schemas.microsoft.com/office/word/2010/wordprocessingCanvas" xmlns:cx="http://schemas.microsoft.com/office/drawing/2014/chartex" xmlns:cx1="http://schemas.microsoft.com/office/drawing/2015/9/8/chartex" xmlns:cx2="http://schemas.microsoft.com/office/drawing/2015/10/21/chartex" xmlns:cx3="http://schemas.microsoft.com/office/drawing/2016/5/9/chartex" xmlns:cx4="http://schemas.microsoft.com/office/drawing/2016/5/10/chartex" xmlns:cx5="http://schemas.microsoft.com/office/drawing/2016/5/11/chartex" xmlns:cx6="http://schemas.microsoft.com/office/drawing/2016/5/12/chartex" xmlns:cx7="http://schemas.microsoft.com/office/drawing/2016/5/13/chartex" xmlns:cx8="http://schemas.microsoft.com/office/drawing/2016/5/14/chartex" xmlns:mc="http://schemas.openxmlformats.org/markup-compatibility/2006" xmlns:aink="http://schemas.microsoft.com/office/drawing/2016/ink" xmlns:am3d="http://schemas.microsoft.com/office/drawing/2017/model3d" xmlns:o="urn:schemas-microsoft-com:office:office" xmlns:oel="http://schemas.microsoft.com/office/2019/extlst" xmlns:r="http://schemas.openxmlformats.org/officeDocument/2006/relationships" xmlns:m="http://schemas.openxmlformats.org/officeDocument/2006/math" xmlns:v="urn:schemas-microsoft-com:vml" xmlns:wp14="http://schemas.microsoft.com/office/word/2010/wordprocessingDrawing" xmlns:wp="http://schemas.openxmlformats.org/drawingml/2006/wordprocessingDrawing" xmlns:w10="urn:schemas-microsoft-com:office:word" xmlns:w="http://schemas.openxmlformats.org/wordprocessingml/2006/main" xmlns:w14="http://schemas.microsoft.com/office/word/2010/wordml" xmlns:w15="http://schemas.microsoft.com/office/word/2012/wordml" xmlns:w16cex="http://schemas.microsoft.com/office/word/2018/wordml/cex" xmlns:w16cid="http://schemas.microsoft.com/office/word/2016/wordml/cid" xmlns:w16="http://schemas.microsoft.com/office/word/2018/wordml" xmlns:w16du="http://schemas.microsoft.com/office/word/2023/wordml/word16du" xmlns:w16sdtdh="http://schemas.microsoft.com/office/word/2020/wordml/sdtdatahash" xmlns:w16sdtfl="http://schemas.microsoft.com/office/word/2024/wordml/sdtformatlock" xmlns:w16se="http://schemas.microsoft.com/office/word/2015/wordml/symex" xmlns:wpg="http://schemas.microsoft.com/office/word/2010/wordprocessingGroup" xmlns:wpi="http://schemas.microsoft.com/office/word/2010/wordprocessingInk" xmlns:wne="http://schemas.microsoft.com/office/word/2006/wordml" xmlns:wps="http://schemas.microsoft.com/office/word/2010/wordprocessingShape" mc:Ignorable="w14 w15 w16se w16cid w16 w16cex w16sdtdh w16sdtfl w16du wp14">
   <w:body>
+    <w:p>
+      <w:pPr>
+        <w:spacing w:before="0" w:line="240" w:lineRule="auto"/>
+        <w:jc w:val="center"/>
+        <w:rPr>
+          <w:b/>
+          <w:bCs/>
+          <w:sz w:val="32"/>
+          <w:szCs w:val="32"/>
+          <w:u w:val="single"/>
+        </w:rPr>
+      </w:pPr>
+      <w:r>
+        <w:rPr>
+          <w:b/>
+          <w:bCs/>
+          <w:sz w:val="32"/>
+          <w:szCs w:val="32"/>
+          <w:u w:val="single"/>
+        </w:rPr>
+        <w:t xml:space="preserve">TS </w:t>
+      </w:r>
+      <w:r>
+        <w:rPr>
+          <w:b/>
+          <w:bCs/>
+          <w:sz w:val="32"/>
+          <w:szCs w:val="32"/>
+          <w:u w:val="single"/>
+        </w:rPr>
+        <w:t>Ghanam</w:t>
+      </w:r>
+      <w:r>
+        <w:rPr>
+          <w:b/>
+          <w:bCs/>
+          <w:sz w:val="32"/>
+          <w:szCs w:val="32"/>
+          <w:u w:val="single"/>
+        </w:rPr>
+        <w:t xml:space="preserve"> – TS 2.2 Malayalam Corrections – Observed till 3</w:t>
+      </w:r>
+      <w:r>
+        <w:rPr>
+          <w:b/>
+          <w:bCs/>
+          <w:sz w:val="32"/>
+          <w:szCs w:val="32"/>
+          <w:u w:val="single"/>
+        </w:rPr>
+        <w:t>1st</w:t>
+      </w:r>
+      <w:r>
+        <w:rPr>
+          <w:b/>
+          <w:bCs/>
+          <w:sz w:val="32"/>
+          <w:szCs w:val="32"/>
+          <w:u w:val="single"/>
+        </w:rPr>
+        <w:t xml:space="preserve"> Ju</w:t>
+      </w:r>
+      <w:r>
+        <w:rPr>
+          <w:b/>
+          <w:bCs/>
+          <w:sz w:val="32"/>
+          <w:szCs w:val="32"/>
+          <w:u w:val="single"/>
+        </w:rPr>
+        <w:t>ly</w:t>
+      </w:r>
+      <w:r>
+        <w:rPr>
+          <w:b/>
+          <w:bCs/>
+          <w:sz w:val="32"/>
+          <w:szCs w:val="32"/>
+          <w:u w:val="single"/>
+        </w:rPr>
+        <w:t xml:space="preserve"> 202</w:t>
+      </w:r>
+      <w:r>
+        <w:rPr>
+          <w:b/>
+          <w:bCs/>
+          <w:sz w:val="32"/>
+          <w:szCs w:val="32"/>
+          <w:u w:val="single"/>
+        </w:rPr>
+        <w:t>6</w:t>
+      </w:r>
+    </w:p>
+    <w:p>
+      <w:pPr>
+        <w:spacing w:before="0" w:line="240" w:lineRule="auto"/>
+        <w:jc w:val="center"/>
+        <w:rPr>
+          <w:b/>
+          <w:bCs/>
+          <w:sz w:val="28"/>
+          <w:szCs w:val="32"/>
+        </w:rPr>
+      </w:pPr>
+      <w:r>
+        <w:rPr>
+          <w:b/>
+          <w:bCs/>
+          <w:sz w:val="28"/>
+          <w:szCs w:val="32"/>
+        </w:rPr>
+        <w:t>(ignore those which are already incorporated in your book’s version and date)</w:t>
+      </w:r>
+    </w:p>
+    <w:tbl>
+      <w:tblPr>
+        <w:tblW w:w="14254" w:type="dxa"/>
+        <w:tblInd w:w="-792" w:type="dxa"/>
+        <w:tblBorders>
+          <w:top w:val="single" w:sz="4" w:space="0" w:color="000000"/>
+          <w:left w:val="single" w:sz="4" w:space="0" w:color="000000"/>
+          <w:bottom w:val="single" w:sz="4" w:space="0" w:color="000000"/>
+          <w:right w:val="single" w:sz="4" w:space="0" w:color="000000"/>
+          <w:insideH w:val="single" w:sz="4" w:space="0" w:color="000000"/>
+          <w:insideV w:val="single" w:sz="4" w:space="0" w:color="000000"/>
+        </w:tblBorders>
+        <w:tblLook w:val="04A0" w:firstRow="1" w:lastRow="0" w:firstColumn="1" w:lastColumn="0" w:noHBand="0" w:noVBand="1"/>
+      </w:tblPr>
+      <w:tblGrid>
+        <w:gridCol w:w="7166"/>
+        <w:gridCol w:w="7088"/>
+      </w:tblGrid>
+      <w:tr>
+        <w:tc>
+          <w:tcPr>
+            <w:tcW w:w="7166" w:type="dxa"/>
+          </w:tcPr>
+          <w:p>
+            <w:pPr>
+              <w:spacing w:before="0" w:line="240" w:lineRule="auto"/>
+              <w:jc w:val="center"/>
+              <w:rPr>
+                <w:b/>
+                <w:sz w:val="32"/>
+                <w:szCs w:val="32"/>
+              </w:rPr>
+            </w:pPr>
+            <w:r>
+              <w:rPr>
+                <w:b/>
+                <w:sz w:val="32"/>
+                <w:szCs w:val="32"/>
+              </w:rPr>
+              <w:t>As Printed</w:t>
+            </w:r>
+          </w:p>
+        </w:tc>
+        <w:tc>
+          <w:tcPr>
+            <w:tcW w:w="7088" w:type="dxa"/>
+          </w:tcPr>
+          <w:p>
+            <w:pPr>
+              <w:spacing w:before="0" w:line="240" w:lineRule="auto"/>
+              <w:ind w:right="-18"/>
+              <w:jc w:val="center"/>
+              <w:rPr>
+                <w:b/>
+                <w:sz w:val="32"/>
+                <w:szCs w:val="32"/>
+              </w:rPr>
+            </w:pPr>
+            <w:r>
+              <w:rPr>
+                <w:b/>
+                <w:sz w:val="32"/>
+                <w:szCs w:val="32"/>
+              </w:rPr>
+              <w:t>To be read as or corrected as</w:t>
+            </w:r>
+            <w:r>
+              <w:rPr>
+                <w:b/>
+                <w:sz w:val="32"/>
+                <w:szCs w:val="32"/>
+              </w:rPr>
+              <w:t xml:space="preserve"> </w:t>
+            </w:r>
+          </w:p>
+        </w:tc>
+      </w:tr>
+      <w:tr>
+        <w:trPr>
+          <w:trHeight w:val="757"/>
+        </w:trPr>
+        <w:tc>
+          <w:tcPr>
+            <w:tcW w:w="7166" w:type="dxa"/>
+          </w:tcPr>
+          <w:p>
+            <w:pPr>
+              <w:widowControl w:val="0"/>
+              <w:autoSpaceDE w:val="0"/>
+              <w:autoSpaceDN w:val="0"/>
+              <w:adjustRightInd w:val="0"/>
+              <w:spacing w:before="0" w:line="240" w:lineRule="auto"/>
+              <w:rPr>
+                <w:rFonts w:cs="BRH Malayalam Extra"/>
+                <w:b/>
+                <w:bCs/>
+                <w:color w:val="000000"/>
+                <w:szCs w:val="40"/>
+              </w:rPr>
+            </w:pPr>
+            <w:r>
+              <w:rPr>
+                <w:rFonts w:cs="BRH Malayalam Extra"/>
+                <w:b/>
+                <w:bCs/>
+                <w:color w:val="000000"/>
+                <w:szCs w:val="40"/>
+              </w:rPr>
+              <w:t>None           None        None                    None</w:t>
+            </w:r>
+          </w:p>
+        </w:tc>
+        <w:tc>
+          <w:tcPr>
+            <w:tcW w:w="7088" w:type="dxa"/>
+          </w:tcPr>
+          <w:p>
+            <w:pPr>
+              <w:widowControl w:val="0"/>
+              <w:autoSpaceDE w:val="0"/>
+              <w:autoSpaceDN w:val="0"/>
+              <w:adjustRightInd w:val="0"/>
+              <w:spacing w:before="0" w:line="240" w:lineRule="auto"/>
+              <w:rPr>
+                <w:rFonts w:cs="BRH Malayalam Extra"/>
+                <w:b/>
+                <w:bCs/>
+                <w:color w:val="000000"/>
+                <w:szCs w:val="40"/>
+              </w:rPr>
+            </w:pPr>
+            <w:r>
+              <w:rPr>
+                <w:rFonts w:cs="BRH Malayalam Extra"/>
+                <w:b/>
+                <w:bCs/>
+                <w:color w:val="000000"/>
+                <w:szCs w:val="40"/>
+              </w:rPr>
+              <w:t>None           None        None                    None</w:t>
+            </w:r>
+          </w:p>
+        </w:tc>
+      </w:tr>
+    </w:tbl>
+    <w:p>
+      <w:pPr>
+        <w:spacing w:before="0" w:line="240" w:lineRule="auto"/>
+        <w:jc w:val="center"/>
+        <w:rPr>
+          <w:b/>
+          <w:bCs/>
+          <w:sz w:val="32"/>
+          <w:szCs w:val="32"/>
+          <w:u w:val="single"/>
+        </w:rPr>
+      </w:pPr>
+      <w:r>
+        <w:rPr>
+          <w:b/>
+          <w:bCs/>
+          <w:sz w:val="32"/>
+          <w:szCs w:val="32"/>
+          <w:u w:val="single"/>
+        </w:rPr>
+        <w:t>================</w:t>
+      </w:r>
+    </w:p>
+    <w:p>
+      <w:pPr>
+        <w:spacing w:before="0" w:line="240" w:lineRule="auto"/>
+        <w:jc w:val="center"/>
+        <w:rPr>
+          <w:b/>
+          <w:bCs/>
+          <w:sz w:val="32"/>
+          <w:szCs w:val="32"/>
+          <w:u w:val="single"/>
+        </w:rPr>
+      </w:pPr>
+    </w:p>
+    <w:p>
+      <w:pPr>
+        <w:spacing w:before="0" w:line="240" w:lineRule="auto"/>
+        <w:jc w:val="center"/>
+        <w:rPr>
+          <w:b/>
+          <w:bCs/>
+          <w:sz w:val="32"/>
+          <w:szCs w:val="32"/>
+          <w:u w:val="single"/>
+        </w:rPr>
+      </w:pPr>
+    </w:p>
+    <w:p>
+      <w:pPr>
+        <w:spacing w:before="0" w:line="240" w:lineRule="auto"/>
+        <w:jc w:val="center"/>
+        <w:rPr>
+          <w:b/>
+          <w:bCs/>
+          <w:sz w:val="32"/>
+          <w:szCs w:val="32"/>
+          <w:u w:val="single"/>
+        </w:rPr>
+      </w:pPr>
+    </w:p>
+    <w:p>
+      <w:pPr>
+        <w:spacing w:before="0" w:line="240" w:lineRule="auto"/>
+        <w:jc w:val="center"/>
+        <w:rPr>
+          <w:b/>
+          <w:bCs/>
+          <w:sz w:val="32"/>
+          <w:szCs w:val="32"/>
+          <w:u w:val="single"/>
+        </w:rPr>
+      </w:pPr>
+    </w:p>
     <w:p>
       <w:pPr>
         <w:spacing w:before="0" w:line="240" w:lineRule="auto"/>
@@ -153,27 +487,7 @@
           <w:sz w:val="28"/>
           <w:szCs w:val="32"/>
         </w:rPr>
-        <w:t>(</w:t>
-      </w:r>
-      <w:proofErr w:type="gramStart"/>
-      <w:r>
-        <w:rPr>
-          <w:b/>
-          <w:bCs/>
-          <w:sz w:val="28"/>
-          <w:szCs w:val="32"/>
-        </w:rPr>
-        <w:t>ignore</w:t>
-      </w:r>
-      <w:proofErr w:type="gramEnd"/>
-      <w:r>
-        <w:rPr>
-          <w:b/>
-          <w:bCs/>
-          <w:sz w:val="28"/>
-          <w:szCs w:val="32"/>
-        </w:rPr>
-        <w:t xml:space="preserve"> those which are already incorporated in your book’s version and date)</w:t>
+        <w:t>(ignore those which are already incorporated in your book’s version and date)</w:t>
       </w:r>
     </w:p>
     <w:tbl>
@@ -1615,7 +1929,18 @@
                 <w:szCs w:val="40"/>
                 <w:lang w:val="it-IT"/>
               </w:rPr>
-              <w:t>¥öeªYx—dy ¥öe</w:t>
+              <w:t>¥öeªYx—</w:t>
+            </w:r>
+            <w:r>
+              <w:rPr>
+                <w:rFonts w:ascii="BRH Malayalam Extra" w:hAnsi="BRH Malayalam Extra" w:cs="BRH Malayalam Extra"/>
+                <w:color w:val="000000"/>
+                <w:sz w:val="32"/>
+                <w:szCs w:val="40"/>
+                <w:lang w:val="it-IT"/>
+              </w:rPr>
+              <w:lastRenderedPageBreak/>
+              <w:t>dy ¥öe</w:t>
             </w:r>
             <w:r>
               <w:rPr>
@@ -2410,7 +2735,6 @@
                 <w:szCs w:val="40"/>
                 <w:lang w:val="it-IT"/>
               </w:rPr>
-              <w:lastRenderedPageBreak/>
               <w:t>7</w:t>
             </w:r>
             <w:r>
@@ -3325,6 +3649,7 @@
                 <w:szCs w:val="40"/>
                 <w:highlight w:val="green"/>
               </w:rPr>
+              <w:lastRenderedPageBreak/>
               <w:t>s</w:t>
             </w:r>
             <w:r>
@@ -4215,7 +4540,6 @@
                 <w:color w:val="000000"/>
                 <w:szCs w:val="40"/>
               </w:rPr>
-              <w:lastRenderedPageBreak/>
               <w:t>7</w:t>
             </w:r>
             <w:r>
@@ -5309,6 +5633,7 @@
                 <w:sz w:val="32"/>
                 <w:szCs w:val="40"/>
               </w:rPr>
+              <w:lastRenderedPageBreak/>
               <w:t>id—dûpPx</w:t>
             </w:r>
             <w:r>
@@ -6020,7 +6345,6 @@
                 <w:color w:val="000000"/>
                 <w:szCs w:val="40"/>
               </w:rPr>
-              <w:lastRenderedPageBreak/>
               <w:t>16</w:t>
             </w:r>
             <w:r>
@@ -7514,6 +7838,7 @@
                 <w:sz w:val="32"/>
                 <w:szCs w:val="40"/>
               </w:rPr>
+              <w:lastRenderedPageBreak/>
               <w:t>id—dûpPx</w:t>
             </w:r>
             <w:r>
@@ -8147,7 +8472,6 @@
                 <w:color w:val="000000"/>
                 <w:szCs w:val="40"/>
               </w:rPr>
-              <w:lastRenderedPageBreak/>
               <w:t>16</w:t>
             </w:r>
             <w:r>
@@ -10389,7 +10713,6 @@
                 <w:szCs w:val="40"/>
                 <w:lang w:val="it-IT"/>
               </w:rPr>
-              <w:lastRenderedPageBreak/>
               <w:t>58</w:t>
             </w:r>
             <w:r>
@@ -11679,7 +12002,6 @@
                 <w:szCs w:val="40"/>
                 <w:lang w:val="it-IT"/>
               </w:rPr>
-              <w:lastRenderedPageBreak/>
               <w:t>57</w:t>
             </w:r>
             <w:r>
@@ -12155,7 +12477,6 @@
                 <w:szCs w:val="40"/>
                 <w:lang w:val="it-IT"/>
               </w:rPr>
-              <w:lastRenderedPageBreak/>
               <w:t>58</w:t>
             </w:r>
             <w:r>
@@ -13515,7 +13836,6 @@
                 <w:szCs w:val="40"/>
                 <w:lang w:val="it-IT"/>
               </w:rPr>
-              <w:lastRenderedPageBreak/>
               <w:t>59</w:t>
             </w:r>
             <w:r>
@@ -13887,6 +14207,7 @@
                 <w:szCs w:val="40"/>
                 <w:lang w:val="it-IT"/>
               </w:rPr>
+              <w:lastRenderedPageBreak/>
               <w:t>60</w:t>
             </w:r>
             <w:r>
@@ -14854,7 +15175,6 @@
                 <w:highlight w:val="yellow"/>
                 <w:lang w:val="it-IT"/>
               </w:rPr>
-              <w:lastRenderedPageBreak/>
               <w:t>sI</w:t>
             </w:r>
             <w:r>
@@ -15422,6 +15742,7 @@
                 <w:szCs w:val="40"/>
                 <w:lang w:val="en-IN"/>
               </w:rPr>
+              <w:lastRenderedPageBreak/>
               <w:t>60</w:t>
             </w:r>
             <w:r>
@@ -16445,7 +16766,6 @@
                 <w:highlight w:val="green"/>
                 <w:lang w:val="en-IN"/>
               </w:rPr>
-              <w:lastRenderedPageBreak/>
               <w:t>s</w:t>
             </w:r>
             <w:r>
@@ -18254,8 +18574,20 @@
                 <w:szCs w:val="40"/>
                 <w:highlight w:val="yellow"/>
               </w:rPr>
-              <w:t>¡¥P— „(³§)¥</w:t>
-            </w:r>
+              <w:t>¡¥P— „(³</w:t>
+            </w:r>
+            <w:proofErr w:type="gramStart"/>
+            <w:r>
+              <w:rPr>
+                <w:rFonts w:ascii="BRH Malayalam Extra" w:hAnsi="BRH Malayalam Extra" w:cs="BRH Malayalam Extra"/>
+                <w:color w:val="000000"/>
+                <w:sz w:val="32"/>
+                <w:szCs w:val="40"/>
+                <w:highlight w:val="yellow"/>
+              </w:rPr>
+              <w:t>§)¥</w:t>
+            </w:r>
+            <w:proofErr w:type="gramEnd"/>
             <w:r>
               <w:rPr>
                 <w:rFonts w:ascii="BRH Malayalam Extra" w:hAnsi="BRH Malayalam Extra" w:cs="BRH Malayalam Extra"/>
@@ -18359,6 +18691,7 @@
                 <w:sz w:val="32"/>
                 <w:szCs w:val="40"/>
               </w:rPr>
+              <w:lastRenderedPageBreak/>
               <w:t>(³</w:t>
             </w:r>
             <w:proofErr w:type="gramStart"/>
@@ -18720,8 +19053,20 @@
                 <w:szCs w:val="40"/>
                 <w:highlight w:val="yellow"/>
               </w:rPr>
-              <w:t>i¡¥P— „(³§)¥</w:t>
-            </w:r>
+              <w:t>i¡¥P— „(³</w:t>
+            </w:r>
+            <w:proofErr w:type="gramStart"/>
+            <w:r>
+              <w:rPr>
+                <w:rFonts w:ascii="BRH Malayalam Extra" w:hAnsi="BRH Malayalam Extra" w:cs="BRH Malayalam Extra"/>
+                <w:color w:val="000000"/>
+                <w:sz w:val="32"/>
+                <w:szCs w:val="40"/>
+                <w:highlight w:val="yellow"/>
+              </w:rPr>
+              <w:t>§)¥</w:t>
+            </w:r>
+            <w:proofErr w:type="gramEnd"/>
             <w:r>
               <w:rPr>
                 <w:rFonts w:ascii="BRH Malayalam Extra" w:hAnsi="BRH Malayalam Extra" w:cs="BRH Malayalam Extra"/>
@@ -18792,7 +19137,27 @@
                 <w:sz w:val="32"/>
                 <w:szCs w:val="40"/>
               </w:rPr>
-              <w:t>—jx (³§)¥tx</w:t>
+              <w:t>—jx (³</w:t>
+            </w:r>
+            <w:proofErr w:type="gramStart"/>
+            <w:r>
+              <w:rPr>
+                <w:rFonts w:ascii="BRH Malayalam Extra" w:hAnsi="BRH Malayalam Extra" w:cs="BRH Malayalam Extra"/>
+                <w:color w:val="000000"/>
+                <w:sz w:val="32"/>
+                <w:szCs w:val="40"/>
+              </w:rPr>
+              <w:t>§)¥</w:t>
+            </w:r>
+            <w:proofErr w:type="gramEnd"/>
+            <w:r>
+              <w:rPr>
+                <w:rFonts w:ascii="BRH Malayalam Extra" w:hAnsi="BRH Malayalam Extra" w:cs="BRH Malayalam Extra"/>
+                <w:color w:val="000000"/>
+                <w:sz w:val="32"/>
+                <w:szCs w:val="40"/>
+              </w:rPr>
+              <w:t>tx</w:t>
             </w:r>
             <w:r>
               <w:rPr>
@@ -18953,7 +19318,27 @@
                 <w:sz w:val="32"/>
                 <w:szCs w:val="40"/>
               </w:rPr>
-              <w:t>—jx (³§)¥tx</w:t>
+              <w:t>—jx (³</w:t>
+            </w:r>
+            <w:proofErr w:type="gramStart"/>
+            <w:r>
+              <w:rPr>
+                <w:rFonts w:ascii="BRH Malayalam Extra" w:hAnsi="BRH Malayalam Extra" w:cs="BRH Malayalam Extra"/>
+                <w:color w:val="000000"/>
+                <w:sz w:val="32"/>
+                <w:szCs w:val="40"/>
+              </w:rPr>
+              <w:t>§)¥</w:t>
+            </w:r>
+            <w:proofErr w:type="gramEnd"/>
+            <w:r>
+              <w:rPr>
+                <w:rFonts w:ascii="BRH Malayalam Extra" w:hAnsi="BRH Malayalam Extra" w:cs="BRH Malayalam Extra"/>
+                <w:color w:val="000000"/>
+                <w:sz w:val="32"/>
+                <w:szCs w:val="40"/>
+              </w:rPr>
+              <w:t>tx</w:t>
             </w:r>
             <w:r>
               <w:rPr>
@@ -19012,7 +19397,6 @@
                 <w:color w:val="000000"/>
                 <w:szCs w:val="40"/>
               </w:rPr>
-              <w:lastRenderedPageBreak/>
               <w:t>1</w:t>
             </w:r>
             <w:r>
@@ -19379,8 +19763,20 @@
                 <w:szCs w:val="40"/>
                 <w:highlight w:val="yellow"/>
               </w:rPr>
-              <w:t>¡¥P— „(³§)¥</w:t>
-            </w:r>
+              <w:t>¡¥P— „(³</w:t>
+            </w:r>
+            <w:proofErr w:type="gramStart"/>
+            <w:r>
+              <w:rPr>
+                <w:rFonts w:ascii="BRH Malayalam Extra" w:hAnsi="BRH Malayalam Extra" w:cs="BRH Malayalam Extra"/>
+                <w:color w:val="000000"/>
+                <w:sz w:val="32"/>
+                <w:szCs w:val="40"/>
+                <w:highlight w:val="yellow"/>
+              </w:rPr>
+              <w:t>§)¥</w:t>
+            </w:r>
+            <w:proofErr w:type="gramEnd"/>
             <w:r>
               <w:rPr>
                 <w:rFonts w:ascii="BRH Malayalam Extra" w:hAnsi="BRH Malayalam Extra" w:cs="BRH Malayalam Extra"/>
@@ -19571,14 +19967,25 @@
               </w:rPr>
               <w:t>„(³</w:t>
             </w:r>
-            <w:r>
-              <w:rPr>
-                <w:rFonts w:ascii="BRH Malayalam Extra" w:hAnsi="BRH Malayalam Extra" w:cs="BRH Malayalam Extra"/>
-                <w:color w:val="000000"/>
-                <w:sz w:val="32"/>
-                <w:szCs w:val="40"/>
-              </w:rPr>
-              <w:t>§)¥tx</w:t>
+            <w:proofErr w:type="gramStart"/>
+            <w:r>
+              <w:rPr>
+                <w:rFonts w:ascii="BRH Malayalam Extra" w:hAnsi="BRH Malayalam Extra" w:cs="BRH Malayalam Extra"/>
+                <w:color w:val="000000"/>
+                <w:sz w:val="32"/>
+                <w:szCs w:val="40"/>
+              </w:rPr>
+              <w:t>§)¥</w:t>
+            </w:r>
+            <w:proofErr w:type="gramEnd"/>
+            <w:r>
+              <w:rPr>
+                <w:rFonts w:ascii="BRH Malayalam Extra" w:hAnsi="BRH Malayalam Extra" w:cs="BRH Malayalam Extra"/>
+                <w:color w:val="000000"/>
+                <w:sz w:val="32"/>
+                <w:szCs w:val="40"/>
+              </w:rPr>
+              <w:t>tx</w:t>
             </w:r>
             <w:r>
               <w:rPr>
@@ -20119,6 +20526,7 @@
                 <w:sz w:val="32"/>
                 <w:szCs w:val="40"/>
               </w:rPr>
+              <w:lastRenderedPageBreak/>
               <w:t>(³</w:t>
             </w:r>
             <w:proofErr w:type="gramStart"/>
@@ -20845,7 +21253,6 @@
                 <w:color w:val="000000"/>
                 <w:szCs w:val="40"/>
               </w:rPr>
-              <w:lastRenderedPageBreak/>
               <w:t>1</w:t>
             </w:r>
             <w:r>
@@ -22498,7 +22905,29 @@
                 <w:szCs w:val="40"/>
                 <w:lang w:val="en-IN"/>
               </w:rPr>
-              <w:t>i¡P— i(³§)¥tx</w:t>
+              <w:t>i¡P— i(³</w:t>
+            </w:r>
+            <w:proofErr w:type="gramStart"/>
+            <w:r>
+              <w:rPr>
+                <w:rFonts w:ascii="BRH Malayalam Extra" w:hAnsi="BRH Malayalam Extra" w:cs="BRH Malayalam Extra"/>
+                <w:color w:val="000000"/>
+                <w:sz w:val="32"/>
+                <w:szCs w:val="40"/>
+                <w:lang w:val="en-IN"/>
+              </w:rPr>
+              <w:t>§)¥</w:t>
+            </w:r>
+            <w:proofErr w:type="gramEnd"/>
+            <w:r>
+              <w:rPr>
+                <w:rFonts w:ascii="BRH Malayalam Extra" w:hAnsi="BRH Malayalam Extra" w:cs="BRH Malayalam Extra"/>
+                <w:color w:val="000000"/>
+                <w:sz w:val="32"/>
+                <w:szCs w:val="40"/>
+                <w:lang w:val="en-IN"/>
+              </w:rPr>
+              <w:t>tx</w:t>
             </w:r>
             <w:r>
               <w:rPr>
@@ -23418,7 +23847,6 @@
                 <w:color w:val="000000"/>
                 <w:szCs w:val="40"/>
               </w:rPr>
-              <w:lastRenderedPageBreak/>
               <w:t>1</w:t>
             </w:r>
             <w:r>
@@ -23986,7 +24414,6 @@
                 <w:color w:val="000000"/>
                 <w:szCs w:val="40"/>
               </w:rPr>
-              <w:lastRenderedPageBreak/>
               <w:t>3</w:t>
             </w:r>
             <w:r>
@@ -24368,23 +24795,34 @@
               </w:rPr>
               <w:t>1</w:t>
             </w:r>
-            <w:r>
-              <w:rPr>
-                <w:rFonts w:ascii="BRH Malayalam Extra" w:hAnsi="BRH Malayalam Extra" w:cs="BRH Malayalam Extra"/>
-                <w:color w:val="000000"/>
-                <w:sz w:val="26"/>
-                <w:szCs w:val="40"/>
-              </w:rPr>
-              <w:t>–</w:t>
-            </w:r>
-            <w:r>
-              <w:rPr>
-                <w:rFonts w:ascii="BRH Malayalam Extra" w:hAnsi="BRH Malayalam Extra" w:cs="BRH Malayalam Extra"/>
-                <w:color w:val="000000"/>
-                <w:sz w:val="32"/>
-                <w:szCs w:val="40"/>
-              </w:rPr>
-              <w:t>)hõ—</w:t>
+            <w:proofErr w:type="gramStart"/>
+            <w:r>
+              <w:rPr>
+                <w:rFonts w:ascii="BRH Malayalam Extra" w:hAnsi="BRH Malayalam Extra" w:cs="BRH Malayalam Extra"/>
+                <w:color w:val="000000"/>
+                <w:sz w:val="26"/>
+                <w:szCs w:val="40"/>
+              </w:rPr>
+              <w:t>–</w:t>
+            </w:r>
+            <w:r>
+              <w:rPr>
+                <w:rFonts w:ascii="BRH Malayalam Extra" w:hAnsi="BRH Malayalam Extra" w:cs="BRH Malayalam Extra"/>
+                <w:color w:val="000000"/>
+                <w:sz w:val="32"/>
+                <w:szCs w:val="40"/>
+              </w:rPr>
+              <w:t>)hõ</w:t>
+            </w:r>
+            <w:proofErr w:type="gramEnd"/>
+            <w:r>
+              <w:rPr>
+                <w:rFonts w:ascii="BRH Malayalam Extra" w:hAnsi="BRH Malayalam Extra" w:cs="BRH Malayalam Extra"/>
+                <w:color w:val="000000"/>
+                <w:sz w:val="32"/>
+                <w:szCs w:val="40"/>
+              </w:rPr>
+              <w:t>—</w:t>
             </w:r>
             <w:r>
               <w:rPr>
@@ -24845,23 +25283,34 @@
               </w:rPr>
               <w:t>1</w:t>
             </w:r>
-            <w:r>
-              <w:rPr>
-                <w:rFonts w:ascii="BRH Malayalam Extra" w:hAnsi="BRH Malayalam Extra" w:cs="BRH Malayalam Extra"/>
-                <w:color w:val="000000"/>
-                <w:sz w:val="26"/>
-                <w:szCs w:val="40"/>
-              </w:rPr>
-              <w:t>–</w:t>
-            </w:r>
-            <w:r>
-              <w:rPr>
-                <w:rFonts w:ascii="BRH Malayalam Extra" w:hAnsi="BRH Malayalam Extra" w:cs="BRH Malayalam Extra"/>
-                <w:color w:val="000000"/>
-                <w:sz w:val="32"/>
-                <w:szCs w:val="40"/>
-              </w:rPr>
-              <w:t>)hõ—</w:t>
+            <w:proofErr w:type="gramStart"/>
+            <w:r>
+              <w:rPr>
+                <w:rFonts w:ascii="BRH Malayalam Extra" w:hAnsi="BRH Malayalam Extra" w:cs="BRH Malayalam Extra"/>
+                <w:color w:val="000000"/>
+                <w:sz w:val="26"/>
+                <w:szCs w:val="40"/>
+              </w:rPr>
+              <w:t>–</w:t>
+            </w:r>
+            <w:r>
+              <w:rPr>
+                <w:rFonts w:ascii="BRH Malayalam Extra" w:hAnsi="BRH Malayalam Extra" w:cs="BRH Malayalam Extra"/>
+                <w:color w:val="000000"/>
+                <w:sz w:val="32"/>
+                <w:szCs w:val="40"/>
+              </w:rPr>
+              <w:t>)hõ</w:t>
+            </w:r>
+            <w:proofErr w:type="gramEnd"/>
+            <w:r>
+              <w:rPr>
+                <w:rFonts w:ascii="BRH Malayalam Extra" w:hAnsi="BRH Malayalam Extra" w:cs="BRH Malayalam Extra"/>
+                <w:color w:val="000000"/>
+                <w:sz w:val="32"/>
+                <w:szCs w:val="40"/>
+              </w:rPr>
+              <w:t>—</w:t>
             </w:r>
             <w:r>
               <w:rPr>
@@ -25398,23 +25847,34 @@
               </w:rPr>
               <w:t>1</w:t>
             </w:r>
-            <w:r>
-              <w:rPr>
-                <w:rFonts w:ascii="BRH Malayalam Extra" w:hAnsi="BRH Malayalam Extra" w:cs="BRH Malayalam Extra"/>
-                <w:color w:val="000000"/>
-                <w:sz w:val="26"/>
-                <w:szCs w:val="40"/>
-              </w:rPr>
-              <w:t>–</w:t>
-            </w:r>
-            <w:r>
-              <w:rPr>
-                <w:rFonts w:ascii="BRH Malayalam Extra" w:hAnsi="BRH Malayalam Extra" w:cs="BRH Malayalam Extra"/>
-                <w:color w:val="000000"/>
-                <w:sz w:val="32"/>
-                <w:szCs w:val="40"/>
-              </w:rPr>
-              <w:t>)hõ—</w:t>
+            <w:proofErr w:type="gramStart"/>
+            <w:r>
+              <w:rPr>
+                <w:rFonts w:ascii="BRH Malayalam Extra" w:hAnsi="BRH Malayalam Extra" w:cs="BRH Malayalam Extra"/>
+                <w:color w:val="000000"/>
+                <w:sz w:val="26"/>
+                <w:szCs w:val="40"/>
+              </w:rPr>
+              <w:t>–</w:t>
+            </w:r>
+            <w:r>
+              <w:rPr>
+                <w:rFonts w:ascii="BRH Malayalam Extra" w:hAnsi="BRH Malayalam Extra" w:cs="BRH Malayalam Extra"/>
+                <w:color w:val="000000"/>
+                <w:sz w:val="32"/>
+                <w:szCs w:val="40"/>
+              </w:rPr>
+              <w:t>)hõ</w:t>
+            </w:r>
+            <w:proofErr w:type="gramEnd"/>
+            <w:r>
+              <w:rPr>
+                <w:rFonts w:ascii="BRH Malayalam Extra" w:hAnsi="BRH Malayalam Extra" w:cs="BRH Malayalam Extra"/>
+                <w:color w:val="000000"/>
+                <w:sz w:val="32"/>
+                <w:szCs w:val="40"/>
+              </w:rPr>
+              <w:t>—</w:t>
             </w:r>
             <w:r>
               <w:rPr>
@@ -25882,6 +26342,7 @@
               </w:rPr>
               <w:t>1</w:t>
             </w:r>
+            <w:proofErr w:type="gramStart"/>
             <w:r>
               <w:rPr>
                 <w:rFonts w:ascii="BRH Malayalam Extra" w:hAnsi="BRH Malayalam Extra" w:cs="BRH Malayalam Extra"/>
@@ -25900,6 +26361,7 @@
               </w:rPr>
               <w:t>)hõ</w:t>
             </w:r>
+            <w:proofErr w:type="gramEnd"/>
             <w:r>
               <w:rPr>
                 <w:rFonts w:ascii="BRH Malayalam Extra" w:hAnsi="BRH Malayalam Extra" w:cs="BRH Malayalam Extra"/>
@@ -26104,6 +26566,7 @@
                 <w:color w:val="000000"/>
                 <w:szCs w:val="40"/>
               </w:rPr>
+              <w:lastRenderedPageBreak/>
               <w:t>29</w:t>
             </w:r>
             <w:r>
@@ -28231,17 +28694,7 @@
                 <w:szCs w:val="40"/>
                 <w:lang w:val="it-IT"/>
               </w:rPr>
-              <w:t xml:space="preserve">) „¥dõx˜ </w:t>
-            </w:r>
-            <w:r>
-              <w:rPr>
-                <w:rFonts w:ascii="BRH Malayalam Extra" w:hAnsi="BRH Malayalam Extra" w:cs="BRH Malayalam Extra"/>
-                <w:sz w:val="32"/>
-                <w:szCs w:val="40"/>
-                <w:lang w:val="it-IT"/>
-              </w:rPr>
-              <w:lastRenderedPageBreak/>
-              <w:t>„dõsë B—s© dx</w:t>
+              <w:t>) „¥dõx˜ „dõsë B—s© dx</w:t>
             </w:r>
             <w:r>
               <w:rPr>
@@ -28286,7 +28739,6 @@
                 <w:rFonts w:cs="BRH Malayalam Extra"/>
                 <w:szCs w:val="40"/>
               </w:rPr>
-              <w:lastRenderedPageBreak/>
               <w:t>36</w:t>
             </w:r>
             <w:r>
@@ -28551,16 +29003,7 @@
                 <w:sz w:val="32"/>
                 <w:szCs w:val="40"/>
               </w:rPr>
-              <w:t xml:space="preserve">) „¥dõx˜ „dõsë </w:t>
-            </w:r>
-            <w:r>
-              <w:rPr>
-                <w:rFonts w:ascii="BRH Malayalam Extra" w:hAnsi="BRH Malayalam Extra" w:cs="BRH Malayalam Extra"/>
-                <w:sz w:val="32"/>
-                <w:szCs w:val="40"/>
-              </w:rPr>
-              <w:lastRenderedPageBreak/>
-              <w:t>B—s© dx</w:t>
+              <w:t>) „¥dõx˜ „dõsë B—s© dx</w:t>
             </w:r>
             <w:r>
               <w:rPr>
@@ -31713,7 +32156,6 @@
                 <w:sz w:val="32"/>
                 <w:szCs w:val="40"/>
               </w:rPr>
-              <w:lastRenderedPageBreak/>
               <w:t>Y Ò—öKx</w:t>
             </w:r>
             <w:r>
@@ -31793,6 +32235,7 @@
                 <w:szCs w:val="40"/>
                 <w:lang w:val="it-IT"/>
               </w:rPr>
+              <w:lastRenderedPageBreak/>
               <w:t>10</w:t>
             </w:r>
             <w:r>
@@ -32615,7 +33058,6 @@
                 <w:szCs w:val="40"/>
                 <w:lang w:val="it-IT"/>
               </w:rPr>
-              <w:lastRenderedPageBreak/>
               <w:t>¥Yx A</w:t>
             </w:r>
             <w:r>
@@ -32681,6 +33123,7 @@
                 <w:szCs w:val="40"/>
                 <w:lang w:val="it-IT"/>
               </w:rPr>
+              <w:lastRenderedPageBreak/>
               <w:t>10</w:t>
             </w:r>
             <w:r>
@@ -43476,27 +43919,7 @@
           <w:sz w:val="28"/>
           <w:szCs w:val="32"/>
         </w:rPr>
-        <w:t>(</w:t>
-      </w:r>
-      <w:proofErr w:type="gramStart"/>
-      <w:r>
-        <w:rPr>
-          <w:b/>
-          <w:bCs/>
-          <w:sz w:val="28"/>
-          <w:szCs w:val="32"/>
-        </w:rPr>
-        <w:t>ignore</w:t>
-      </w:r>
-      <w:proofErr w:type="gramEnd"/>
-      <w:r>
-        <w:rPr>
-          <w:b/>
-          <w:bCs/>
-          <w:sz w:val="28"/>
-          <w:szCs w:val="32"/>
-        </w:rPr>
-        <w:t xml:space="preserve"> those which are already incorporated in your book’s version and date)</w:t>
+        <w:t>(ignore those which are already incorporated in your book’s version and date)</w:t>
       </w:r>
     </w:p>
     <w:tbl>
@@ -43798,7 +44221,7 @@
 </file>
 
 <file path=word/endnotes.xml><?xml version="1.0" encoding="utf-8"?>
-<w:endnotes xmlns:wpc="http://schemas.microsoft.com/office/word/2010/wordprocessingCanvas" xmlns:cx="http://schemas.microsoft.com/office/drawing/2014/chartex" xmlns:cx1="http://schemas.microsoft.com/office/drawing/2015/9/8/chartex" xmlns:cx2="http://schemas.microsoft.com/office/drawing/2015/10/21/chartex" xmlns:cx3="http://schemas.microsoft.com/office/drawing/2016/5/9/chartex" xmlns:cx4="http://schemas.microsoft.com/office/drawing/2016/5/10/chartex" xmlns:cx5="http://schemas.microsoft.com/office/drawing/2016/5/11/chartex" xmlns:cx6="http://schemas.microsoft.com/office/drawing/2016/5/12/chartex" xmlns:cx7="http://schemas.microsoft.com/office/drawing/2016/5/13/chartex" xmlns:cx8="http://schemas.microsoft.com/office/drawing/2016/5/14/chartex" xmlns:mc="http://schemas.openxmlformats.org/markup-compatibility/2006" xmlns:aink="http://schemas.microsoft.com/office/drawing/2016/ink" xmlns:am3d="http://schemas.microsoft.com/office/drawing/2017/model3d" xmlns:o="urn:schemas-microsoft-com:office:office" xmlns:oel="http://schemas.microsoft.com/office/2019/extlst" xmlns:r="http://schemas.openxmlformats.org/officeDocument/2006/relationships" xmlns:m="http://schemas.openxmlformats.org/officeDocument/2006/math" xmlns:v="urn:schemas-microsoft-com:vml" xmlns:wp14="http://schemas.microsoft.com/office/word/2010/wordprocessingDrawing" xmlns:wp="http://schemas.openxmlformats.org/drawingml/2006/wordprocessingDrawing" xmlns:w10="urn:schemas-microsoft-com:office:word" xmlns:w="http://schemas.openxmlformats.org/wordprocessingml/2006/main" xmlns:w14="http://schemas.microsoft.com/office/word/2010/wordml" xmlns:w15="http://schemas.microsoft.com/office/word/2012/wordml" xmlns:w16cex="http://schemas.microsoft.com/office/word/2018/wordml/cex" xmlns:w16cid="http://schemas.microsoft.com/office/word/2016/wordml/cid" xmlns:w16="http://schemas.microsoft.com/office/word/2018/wordml" xmlns:w16sdtdh="http://schemas.microsoft.com/office/word/2020/wordml/sdtdatahash" xmlns:w16se="http://schemas.microsoft.com/office/word/2015/wordml/symex" xmlns:wpg="http://schemas.microsoft.com/office/word/2010/wordprocessingGroup" xmlns:wpi="http://schemas.microsoft.com/office/word/2010/wordprocessingInk" xmlns:wne="http://schemas.microsoft.com/office/word/2006/wordml" xmlns:wps="http://schemas.microsoft.com/office/word/2010/wordprocessingShape" mc:Ignorable="w14 w15 w16se w16cid w16 w16cex w16sdtdh wp14">
+<w:endnotes xmlns:wpc="http://schemas.microsoft.com/office/word/2010/wordprocessingCanvas" xmlns:cx="http://schemas.microsoft.com/office/drawing/2014/chartex" xmlns:cx1="http://schemas.microsoft.com/office/drawing/2015/9/8/chartex" xmlns:cx2="http://schemas.microsoft.com/office/drawing/2015/10/21/chartex" xmlns:cx3="http://schemas.microsoft.com/office/drawing/2016/5/9/chartex" xmlns:cx4="http://schemas.microsoft.com/office/drawing/2016/5/10/chartex" xmlns:cx5="http://schemas.microsoft.com/office/drawing/2016/5/11/chartex" xmlns:cx6="http://schemas.microsoft.com/office/drawing/2016/5/12/chartex" xmlns:cx7="http://schemas.microsoft.com/office/drawing/2016/5/13/chartex" xmlns:cx8="http://schemas.microsoft.com/office/drawing/2016/5/14/chartex" xmlns:mc="http://schemas.openxmlformats.org/markup-compatibility/2006" xmlns:aink="http://schemas.microsoft.com/office/drawing/2016/ink" xmlns:am3d="http://schemas.microsoft.com/office/drawing/2017/model3d" xmlns:o="urn:schemas-microsoft-com:office:office" xmlns:oel="http://schemas.microsoft.com/office/2019/extlst" xmlns:r="http://schemas.openxmlformats.org/officeDocument/2006/relationships" xmlns:m="http://schemas.openxmlformats.org/officeDocument/2006/math" xmlns:v="urn:schemas-microsoft-com:vml" xmlns:wp14="http://schemas.microsoft.com/office/word/2010/wordprocessingDrawing" xmlns:wp="http://schemas.openxmlformats.org/drawingml/2006/wordprocessingDrawing" xmlns:w10="urn:schemas-microsoft-com:office:word" xmlns:w="http://schemas.openxmlformats.org/wordprocessingml/2006/main" xmlns:w14="http://schemas.microsoft.com/office/word/2010/wordml" xmlns:w15="http://schemas.microsoft.com/office/word/2012/wordml" xmlns:w16cex="http://schemas.microsoft.com/office/word/2018/wordml/cex" xmlns:w16cid="http://schemas.microsoft.com/office/word/2016/wordml/cid" xmlns:w16="http://schemas.microsoft.com/office/word/2018/wordml" xmlns:w16du="http://schemas.microsoft.com/office/word/2023/wordml/word16du" xmlns:w16sdtdh="http://schemas.microsoft.com/office/word/2020/wordml/sdtdatahash" xmlns:w16sdtfl="http://schemas.microsoft.com/office/word/2024/wordml/sdtformatlock" xmlns:w16se="http://schemas.microsoft.com/office/word/2015/wordml/symex" xmlns:wpg="http://schemas.microsoft.com/office/word/2010/wordprocessingGroup" xmlns:wpi="http://schemas.microsoft.com/office/word/2010/wordprocessingInk" xmlns:wne="http://schemas.microsoft.com/office/word/2006/wordml" xmlns:wps="http://schemas.microsoft.com/office/word/2010/wordprocessingShape" mc:Ignorable="w14 w15 w16se w16cid w16 w16cex w16sdtdh w16sdtfl w16du wp14">
   <w:endnote w:type="separator" w:id="-1">
     <w:p>
       <w:pPr>
@@ -43823,7 +44246,7 @@
 </file>
 
 <file path=word/footer1.xml><?xml version="1.0" encoding="utf-8"?>
-<w:ftr xmlns:wpc="http://schemas.microsoft.com/office/word/2010/wordprocessingCanvas" xmlns:cx="http://schemas.microsoft.com/office/drawing/2014/chartex" xmlns:cx1="http://schemas.microsoft.com/office/drawing/2015/9/8/chartex" xmlns:cx2="http://schemas.microsoft.com/office/drawing/2015/10/21/chartex" xmlns:cx3="http://schemas.microsoft.com/office/drawing/2016/5/9/chartex" xmlns:cx4="http://schemas.microsoft.com/office/drawing/2016/5/10/chartex" xmlns:cx5="http://schemas.microsoft.com/office/drawing/2016/5/11/chartex" xmlns:cx6="http://schemas.microsoft.com/office/drawing/2016/5/12/chartex" xmlns:cx7="http://schemas.microsoft.com/office/drawing/2016/5/13/chartex" xmlns:cx8="http://schemas.microsoft.com/office/drawing/2016/5/14/chartex" xmlns:mc="http://schemas.openxmlformats.org/markup-compatibility/2006" xmlns:aink="http://schemas.microsoft.com/office/drawing/2016/ink" xmlns:am3d="http://schemas.microsoft.com/office/drawing/2017/model3d" xmlns:o="urn:schemas-microsoft-com:office:office" xmlns:oel="http://schemas.microsoft.com/office/2019/extlst" xmlns:r="http://schemas.openxmlformats.org/officeDocument/2006/relationships" xmlns:m="http://schemas.openxmlformats.org/officeDocument/2006/math" xmlns:v="urn:schemas-microsoft-com:vml" xmlns:wp14="http://schemas.microsoft.com/office/word/2010/wordprocessingDrawing" xmlns:wp="http://schemas.openxmlformats.org/drawingml/2006/wordprocessingDrawing" xmlns:w10="urn:schemas-microsoft-com:office:word" xmlns:w="http://schemas.openxmlformats.org/wordprocessingml/2006/main" xmlns:w14="http://schemas.microsoft.com/office/word/2010/wordml" xmlns:w15="http://schemas.microsoft.com/office/word/2012/wordml" xmlns:w16cex="http://schemas.microsoft.com/office/word/2018/wordml/cex" xmlns:w16cid="http://schemas.microsoft.com/office/word/2016/wordml/cid" xmlns:w16="http://schemas.microsoft.com/office/word/2018/wordml" xmlns:w16sdtdh="http://schemas.microsoft.com/office/word/2020/wordml/sdtdatahash" xmlns:w16se="http://schemas.microsoft.com/office/word/2015/wordml/symex" xmlns:wpg="http://schemas.microsoft.com/office/word/2010/wordprocessingGroup" xmlns:wpi="http://schemas.microsoft.com/office/word/2010/wordprocessingInk" xmlns:wne="http://schemas.microsoft.com/office/word/2006/wordml" xmlns:wps="http://schemas.microsoft.com/office/word/2010/wordprocessingShape" mc:Ignorable="w14 w15 w16se w16cid w16 w16cex w16sdtdh wp14">
+<w:ftr xmlns:wpc="http://schemas.microsoft.com/office/word/2010/wordprocessingCanvas" xmlns:cx="http://schemas.microsoft.com/office/drawing/2014/chartex" xmlns:cx1="http://schemas.microsoft.com/office/drawing/2015/9/8/chartex" xmlns:cx2="http://schemas.microsoft.com/office/drawing/2015/10/21/chartex" xmlns:cx3="http://schemas.microsoft.com/office/drawing/2016/5/9/chartex" xmlns:cx4="http://schemas.microsoft.com/office/drawing/2016/5/10/chartex" xmlns:cx5="http://schemas.microsoft.com/office/drawing/2016/5/11/chartex" xmlns:cx6="http://schemas.microsoft.com/office/drawing/2016/5/12/chartex" xmlns:cx7="http://schemas.microsoft.com/office/drawing/2016/5/13/chartex" xmlns:cx8="http://schemas.microsoft.com/office/drawing/2016/5/14/chartex" xmlns:mc="http://schemas.openxmlformats.org/markup-compatibility/2006" xmlns:aink="http://schemas.microsoft.com/office/drawing/2016/ink" xmlns:am3d="http://schemas.microsoft.com/office/drawing/2017/model3d" xmlns:o="urn:schemas-microsoft-com:office:office" xmlns:oel="http://schemas.microsoft.com/office/2019/extlst" xmlns:r="http://schemas.openxmlformats.org/officeDocument/2006/relationships" xmlns:m="http://schemas.openxmlformats.org/officeDocument/2006/math" xmlns:v="urn:schemas-microsoft-com:vml" xmlns:wp14="http://schemas.microsoft.com/office/word/2010/wordprocessingDrawing" xmlns:wp="http://schemas.openxmlformats.org/drawingml/2006/wordprocessingDrawing" xmlns:w10="urn:schemas-microsoft-com:office:word" xmlns:w="http://schemas.openxmlformats.org/wordprocessingml/2006/main" xmlns:w14="http://schemas.microsoft.com/office/word/2010/wordml" xmlns:w15="http://schemas.microsoft.com/office/word/2012/wordml" xmlns:w16cex="http://schemas.microsoft.com/office/word/2018/wordml/cex" xmlns:w16cid="http://schemas.microsoft.com/office/word/2016/wordml/cid" xmlns:w16="http://schemas.microsoft.com/office/word/2018/wordml" xmlns:w16du="http://schemas.microsoft.com/office/word/2023/wordml/word16du" xmlns:w16sdtdh="http://schemas.microsoft.com/office/word/2020/wordml/sdtdatahash" xmlns:w16sdtfl="http://schemas.microsoft.com/office/word/2024/wordml/sdtformatlock" xmlns:w16se="http://schemas.microsoft.com/office/word/2015/wordml/symex" xmlns:wpg="http://schemas.microsoft.com/office/word/2010/wordprocessingGroup" xmlns:wpi="http://schemas.microsoft.com/office/word/2010/wordprocessingInk" xmlns:wne="http://schemas.microsoft.com/office/word/2006/wordml" xmlns:wps="http://schemas.microsoft.com/office/word/2010/wordprocessingShape" mc:Ignorable="w14 w15 w16se w16cid w16 w16cex w16sdtdh w16sdtfl w16du wp14">
   <w:p>
     <w:pPr>
       <w:pBdr>
@@ -44008,7 +44431,7 @@
 </file>
 
 <file path=word/footer2.xml><?xml version="1.0" encoding="utf-8"?>
-<w:ftr xmlns:wpc="http://schemas.microsoft.com/office/word/2010/wordprocessingCanvas" xmlns:cx="http://schemas.microsoft.com/office/drawing/2014/chartex" xmlns:cx1="http://schemas.microsoft.com/office/drawing/2015/9/8/chartex" xmlns:cx2="http://schemas.microsoft.com/office/drawing/2015/10/21/chartex" xmlns:cx3="http://schemas.microsoft.com/office/drawing/2016/5/9/chartex" xmlns:cx4="http://schemas.microsoft.com/office/drawing/2016/5/10/chartex" xmlns:cx5="http://schemas.microsoft.com/office/drawing/2016/5/11/chartex" xmlns:cx6="http://schemas.microsoft.com/office/drawing/2016/5/12/chartex" xmlns:cx7="http://schemas.microsoft.com/office/drawing/2016/5/13/chartex" xmlns:cx8="http://schemas.microsoft.com/office/drawing/2016/5/14/chartex" xmlns:mc="http://schemas.openxmlformats.org/markup-compatibility/2006" xmlns:aink="http://schemas.microsoft.com/office/drawing/2016/ink" xmlns:am3d="http://schemas.microsoft.com/office/drawing/2017/model3d" xmlns:o="urn:schemas-microsoft-com:office:office" xmlns:oel="http://schemas.microsoft.com/office/2019/extlst" xmlns:r="http://schemas.openxmlformats.org/officeDocument/2006/relationships" xmlns:m="http://schemas.openxmlformats.org/officeDocument/2006/math" xmlns:v="urn:schemas-microsoft-com:vml" xmlns:wp14="http://schemas.microsoft.com/office/word/2010/wordprocessingDrawing" xmlns:wp="http://schemas.openxmlformats.org/drawingml/2006/wordprocessingDrawing" xmlns:w10="urn:schemas-microsoft-com:office:word" xmlns:w="http://schemas.openxmlformats.org/wordprocessingml/2006/main" xmlns:w14="http://schemas.microsoft.com/office/word/2010/wordml" xmlns:w15="http://schemas.microsoft.com/office/word/2012/wordml" xmlns:w16cex="http://schemas.microsoft.com/office/word/2018/wordml/cex" xmlns:w16cid="http://schemas.microsoft.com/office/word/2016/wordml/cid" xmlns:w16="http://schemas.microsoft.com/office/word/2018/wordml" xmlns:w16sdtdh="http://schemas.microsoft.com/office/word/2020/wordml/sdtdatahash" xmlns:w16se="http://schemas.microsoft.com/office/word/2015/wordml/symex" xmlns:wpg="http://schemas.microsoft.com/office/word/2010/wordprocessingGroup" xmlns:wpi="http://schemas.microsoft.com/office/word/2010/wordprocessingInk" xmlns:wne="http://schemas.microsoft.com/office/word/2006/wordml" xmlns:wps="http://schemas.microsoft.com/office/word/2010/wordprocessingShape" mc:Ignorable="w14 w15 w16se w16cid w16 w16cex w16sdtdh wp14">
+<w:ftr xmlns:wpc="http://schemas.microsoft.com/office/word/2010/wordprocessingCanvas" xmlns:cx="http://schemas.microsoft.com/office/drawing/2014/chartex" xmlns:cx1="http://schemas.microsoft.com/office/drawing/2015/9/8/chartex" xmlns:cx2="http://schemas.microsoft.com/office/drawing/2015/10/21/chartex" xmlns:cx3="http://schemas.microsoft.com/office/drawing/2016/5/9/chartex" xmlns:cx4="http://schemas.microsoft.com/office/drawing/2016/5/10/chartex" xmlns:cx5="http://schemas.microsoft.com/office/drawing/2016/5/11/chartex" xmlns:cx6="http://schemas.microsoft.com/office/drawing/2016/5/12/chartex" xmlns:cx7="http://schemas.microsoft.com/office/drawing/2016/5/13/chartex" xmlns:cx8="http://schemas.microsoft.com/office/drawing/2016/5/14/chartex" xmlns:mc="http://schemas.openxmlformats.org/markup-compatibility/2006" xmlns:aink="http://schemas.microsoft.com/office/drawing/2016/ink" xmlns:am3d="http://schemas.microsoft.com/office/drawing/2017/model3d" xmlns:o="urn:schemas-microsoft-com:office:office" xmlns:oel="http://schemas.microsoft.com/office/2019/extlst" xmlns:r="http://schemas.openxmlformats.org/officeDocument/2006/relationships" xmlns:m="http://schemas.openxmlformats.org/officeDocument/2006/math" xmlns:v="urn:schemas-microsoft-com:vml" xmlns:wp14="http://schemas.microsoft.com/office/word/2010/wordprocessingDrawing" xmlns:wp="http://schemas.openxmlformats.org/drawingml/2006/wordprocessingDrawing" xmlns:w10="urn:schemas-microsoft-com:office:word" xmlns:w="http://schemas.openxmlformats.org/wordprocessingml/2006/main" xmlns:w14="http://schemas.microsoft.com/office/word/2010/wordml" xmlns:w15="http://schemas.microsoft.com/office/word/2012/wordml" xmlns:w16cex="http://schemas.microsoft.com/office/word/2018/wordml/cex" xmlns:w16cid="http://schemas.microsoft.com/office/word/2016/wordml/cid" xmlns:w16="http://schemas.microsoft.com/office/word/2018/wordml" xmlns:w16du="http://schemas.microsoft.com/office/word/2023/wordml/word16du" xmlns:w16sdtdh="http://schemas.microsoft.com/office/word/2020/wordml/sdtdatahash" xmlns:w16sdtfl="http://schemas.microsoft.com/office/word/2024/wordml/sdtformatlock" xmlns:w16se="http://schemas.microsoft.com/office/word/2015/wordml/symex" xmlns:wpg="http://schemas.microsoft.com/office/word/2010/wordprocessingGroup" xmlns:wpi="http://schemas.microsoft.com/office/word/2010/wordprocessingInk" xmlns:wne="http://schemas.microsoft.com/office/word/2006/wordml" xmlns:wps="http://schemas.microsoft.com/office/word/2010/wordprocessingShape" mc:Ignorable="w14 w15 w16se w16cid w16 w16cex w16sdtdh w16sdtfl w16du wp14">
   <w:p>
     <w:pPr>
       <w:pBdr>
@@ -44214,7 +44637,7 @@
 </file>
 
 <file path=word/footnotes.xml><?xml version="1.0" encoding="utf-8"?>
-<w:footnotes xmlns:wpc="http://schemas.microsoft.com/office/word/2010/wordprocessingCanvas" xmlns:cx="http://schemas.microsoft.com/office/drawing/2014/chartex" xmlns:cx1="http://schemas.microsoft.com/office/drawing/2015/9/8/chartex" xmlns:cx2="http://schemas.microsoft.com/office/drawing/2015/10/21/chartex" xmlns:cx3="http://schemas.microsoft.com/office/drawing/2016/5/9/chartex" xmlns:cx4="http://schemas.microsoft.com/office/drawing/2016/5/10/chartex" xmlns:cx5="http://schemas.microsoft.com/office/drawing/2016/5/11/chartex" xmlns:cx6="http://schemas.microsoft.com/office/drawing/2016/5/12/chartex" xmlns:cx7="http://schemas.microsoft.com/office/drawing/2016/5/13/chartex" xmlns:cx8="http://schemas.microsoft.com/office/drawing/2016/5/14/chartex" xmlns:mc="http://schemas.openxmlformats.org/markup-compatibility/2006" xmlns:aink="http://schemas.microsoft.com/office/drawing/2016/ink" xmlns:am3d="http://schemas.microsoft.com/office/drawing/2017/model3d" xmlns:o="urn:schemas-microsoft-com:office:office" xmlns:oel="http://schemas.microsoft.com/office/2019/extlst" xmlns:r="http://schemas.openxmlformats.org/officeDocument/2006/relationships" xmlns:m="http://schemas.openxmlformats.org/officeDocument/2006/math" xmlns:v="urn:schemas-microsoft-com:vml" xmlns:wp14="http://schemas.microsoft.com/office/word/2010/wordprocessingDrawing" xmlns:wp="http://schemas.openxmlformats.org/drawingml/2006/wordprocessingDrawing" xmlns:w10="urn:schemas-microsoft-com:office:word" xmlns:w="http://schemas.openxmlformats.org/wordprocessingml/2006/main" xmlns:w14="http://schemas.microsoft.com/office/word/2010/wordml" xmlns:w15="http://schemas.microsoft.com/office/word/2012/wordml" xmlns:w16cex="http://schemas.microsoft.com/office/word/2018/wordml/cex" xmlns:w16cid="http://schemas.microsoft.com/office/word/2016/wordml/cid" xmlns:w16="http://schemas.microsoft.com/office/word/2018/wordml" xmlns:w16sdtdh="http://schemas.microsoft.com/office/word/2020/wordml/sdtdatahash" xmlns:w16se="http://schemas.microsoft.com/office/word/2015/wordml/symex" xmlns:wpg="http://schemas.microsoft.com/office/word/2010/wordprocessingGroup" xmlns:wpi="http://schemas.microsoft.com/office/word/2010/wordprocessingInk" xmlns:wne="http://schemas.microsoft.com/office/word/2006/wordml" xmlns:wps="http://schemas.microsoft.com/office/word/2010/wordprocessingShape" mc:Ignorable="w14 w15 w16se w16cid w16 w16cex w16sdtdh wp14">
+<w:footnotes xmlns:wpc="http://schemas.microsoft.com/office/word/2010/wordprocessingCanvas" xmlns:cx="http://schemas.microsoft.com/office/drawing/2014/chartex" xmlns:cx1="http://schemas.microsoft.com/office/drawing/2015/9/8/chartex" xmlns:cx2="http://schemas.microsoft.com/office/drawing/2015/10/21/chartex" xmlns:cx3="http://schemas.microsoft.com/office/drawing/2016/5/9/chartex" xmlns:cx4="http://schemas.microsoft.com/office/drawing/2016/5/10/chartex" xmlns:cx5="http://schemas.microsoft.com/office/drawing/2016/5/11/chartex" xmlns:cx6="http://schemas.microsoft.com/office/drawing/2016/5/12/chartex" xmlns:cx7="http://schemas.microsoft.com/office/drawing/2016/5/13/chartex" xmlns:cx8="http://schemas.microsoft.com/office/drawing/2016/5/14/chartex" xmlns:mc="http://schemas.openxmlformats.org/markup-compatibility/2006" xmlns:aink="http://schemas.microsoft.com/office/drawing/2016/ink" xmlns:am3d="http://schemas.microsoft.com/office/drawing/2017/model3d" xmlns:o="urn:schemas-microsoft-com:office:office" xmlns:oel="http://schemas.microsoft.com/office/2019/extlst" xmlns:r="http://schemas.openxmlformats.org/officeDocument/2006/relationships" xmlns:m="http://schemas.openxmlformats.org/officeDocument/2006/math" xmlns:v="urn:schemas-microsoft-com:vml" xmlns:wp14="http://schemas.microsoft.com/office/word/2010/wordprocessingDrawing" xmlns:wp="http://schemas.openxmlformats.org/drawingml/2006/wordprocessingDrawing" xmlns:w10="urn:schemas-microsoft-com:office:word" xmlns:w="http://schemas.openxmlformats.org/wordprocessingml/2006/main" xmlns:w14="http://schemas.microsoft.com/office/word/2010/wordml" xmlns:w15="http://schemas.microsoft.com/office/word/2012/wordml" xmlns:w16cex="http://schemas.microsoft.com/office/word/2018/wordml/cex" xmlns:w16cid="http://schemas.microsoft.com/office/word/2016/wordml/cid" xmlns:w16="http://schemas.microsoft.com/office/word/2018/wordml" xmlns:w16du="http://schemas.microsoft.com/office/word/2023/wordml/word16du" xmlns:w16sdtdh="http://schemas.microsoft.com/office/word/2020/wordml/sdtdatahash" xmlns:w16sdtfl="http://schemas.microsoft.com/office/word/2024/wordml/sdtformatlock" xmlns:w16se="http://schemas.microsoft.com/office/word/2015/wordml/symex" xmlns:wpg="http://schemas.microsoft.com/office/word/2010/wordprocessingGroup" xmlns:wpi="http://schemas.microsoft.com/office/word/2010/wordprocessingInk" xmlns:wne="http://schemas.microsoft.com/office/word/2006/wordml" xmlns:wps="http://schemas.microsoft.com/office/word/2010/wordprocessingShape" mc:Ignorable="w14 w15 w16se w16cid w16 w16cex w16sdtdh w16sdtfl w16du wp14">
   <w:footnote w:type="separator" w:id="-1">
     <w:p>
       <w:pPr>
@@ -44239,7 +44662,7 @@
 </file>
 
 <file path=word/header1.xml><?xml version="1.0" encoding="utf-8"?>
-<w:hdr xmlns:wpc="http://schemas.microsoft.com/office/word/2010/wordprocessingCanvas" xmlns:cx="http://schemas.microsoft.com/office/drawing/2014/chartex" xmlns:cx1="http://schemas.microsoft.com/office/drawing/2015/9/8/chartex" xmlns:cx2="http://schemas.microsoft.com/office/drawing/2015/10/21/chartex" xmlns:cx3="http://schemas.microsoft.com/office/drawing/2016/5/9/chartex" xmlns:cx4="http://schemas.microsoft.com/office/drawing/2016/5/10/chartex" xmlns:cx5="http://schemas.microsoft.com/office/drawing/2016/5/11/chartex" xmlns:cx6="http://schemas.microsoft.com/office/drawing/2016/5/12/chartex" xmlns:cx7="http://schemas.microsoft.com/office/drawing/2016/5/13/chartex" xmlns:cx8="http://schemas.microsoft.com/office/drawing/2016/5/14/chartex" xmlns:mc="http://schemas.openxmlformats.org/markup-compatibility/2006" xmlns:aink="http://schemas.microsoft.com/office/drawing/2016/ink" xmlns:am3d="http://schemas.microsoft.com/office/drawing/2017/model3d" xmlns:o="urn:schemas-microsoft-com:office:office" xmlns:oel="http://schemas.microsoft.com/office/2019/extlst" xmlns:r="http://schemas.openxmlformats.org/officeDocument/2006/relationships" xmlns:m="http://schemas.openxmlformats.org/officeDocument/2006/math" xmlns:v="urn:schemas-microsoft-com:vml" xmlns:wp14="http://schemas.microsoft.com/office/word/2010/wordprocessingDrawing" xmlns:wp="http://schemas.openxmlformats.org/drawingml/2006/wordprocessingDrawing" xmlns:w10="urn:schemas-microsoft-com:office:word" xmlns:w="http://schemas.openxmlformats.org/wordprocessingml/2006/main" xmlns:w14="http://schemas.microsoft.com/office/word/2010/wordml" xmlns:w15="http://schemas.microsoft.com/office/word/2012/wordml" xmlns:w16cex="http://schemas.microsoft.com/office/word/2018/wordml/cex" xmlns:w16cid="http://schemas.microsoft.com/office/word/2016/wordml/cid" xmlns:w16="http://schemas.microsoft.com/office/word/2018/wordml" xmlns:w16sdtdh="http://schemas.microsoft.com/office/word/2020/wordml/sdtdatahash" xmlns:w16se="http://schemas.microsoft.com/office/word/2015/wordml/symex" xmlns:wpg="http://schemas.microsoft.com/office/word/2010/wordprocessingGroup" xmlns:wpi="http://schemas.microsoft.com/office/word/2010/wordprocessingInk" xmlns:wne="http://schemas.microsoft.com/office/word/2006/wordml" xmlns:wps="http://schemas.microsoft.com/office/word/2010/wordprocessingShape" mc:Ignorable="w14 w15 w16se w16cid w16 w16cex w16sdtdh wp14">
+<w:hdr xmlns:wpc="http://schemas.microsoft.com/office/word/2010/wordprocessingCanvas" xmlns:cx="http://schemas.microsoft.com/office/drawing/2014/chartex" xmlns:cx1="http://schemas.microsoft.com/office/drawing/2015/9/8/chartex" xmlns:cx2="http://schemas.microsoft.com/office/drawing/2015/10/21/chartex" xmlns:cx3="http://schemas.microsoft.com/office/drawing/2016/5/9/chartex" xmlns:cx4="http://schemas.microsoft.com/office/drawing/2016/5/10/chartex" xmlns:cx5="http://schemas.microsoft.com/office/drawing/2016/5/11/chartex" xmlns:cx6="http://schemas.microsoft.com/office/drawing/2016/5/12/chartex" xmlns:cx7="http://schemas.microsoft.com/office/drawing/2016/5/13/chartex" xmlns:cx8="http://schemas.microsoft.com/office/drawing/2016/5/14/chartex" xmlns:mc="http://schemas.openxmlformats.org/markup-compatibility/2006" xmlns:aink="http://schemas.microsoft.com/office/drawing/2016/ink" xmlns:am3d="http://schemas.microsoft.com/office/drawing/2017/model3d" xmlns:o="urn:schemas-microsoft-com:office:office" xmlns:oel="http://schemas.microsoft.com/office/2019/extlst" xmlns:r="http://schemas.openxmlformats.org/officeDocument/2006/relationships" xmlns:m="http://schemas.openxmlformats.org/officeDocument/2006/math" xmlns:v="urn:schemas-microsoft-com:vml" xmlns:wp14="http://schemas.microsoft.com/office/word/2010/wordprocessingDrawing" xmlns:wp="http://schemas.openxmlformats.org/drawingml/2006/wordprocessingDrawing" xmlns:w10="urn:schemas-microsoft-com:office:word" xmlns:w="http://schemas.openxmlformats.org/wordprocessingml/2006/main" xmlns:w14="http://schemas.microsoft.com/office/word/2010/wordml" xmlns:w15="http://schemas.microsoft.com/office/word/2012/wordml" xmlns:w16cex="http://schemas.microsoft.com/office/word/2018/wordml/cex" xmlns:w16cid="http://schemas.microsoft.com/office/word/2016/wordml/cid" xmlns:w16="http://schemas.microsoft.com/office/word/2018/wordml" xmlns:w16du="http://schemas.microsoft.com/office/word/2023/wordml/word16du" xmlns:w16sdtdh="http://schemas.microsoft.com/office/word/2020/wordml/sdtdatahash" xmlns:w16sdtfl="http://schemas.microsoft.com/office/word/2024/wordml/sdtformatlock" xmlns:w16se="http://schemas.microsoft.com/office/word/2015/wordml/symex" xmlns:wpg="http://schemas.microsoft.com/office/word/2010/wordprocessingGroup" xmlns:wpi="http://schemas.microsoft.com/office/word/2010/wordprocessingInk" xmlns:wne="http://schemas.microsoft.com/office/word/2006/wordml" xmlns:wps="http://schemas.microsoft.com/office/word/2010/wordprocessingShape" mc:Ignorable="w14 w15 w16se w16cid w16 w16cex w16sdtdh w16sdtfl w16du wp14">
   <w:p>
     <w:pPr>
       <w:pStyle w:val="Header"/>
@@ -44260,7 +44683,7 @@
 </file>
 
 <file path=word/header2.xml><?xml version="1.0" encoding="utf-8"?>
-<w:hdr xmlns:wpc="http://schemas.microsoft.com/office/word/2010/wordprocessingCanvas" xmlns:cx="http://schemas.microsoft.com/office/drawing/2014/chartex" xmlns:cx1="http://schemas.microsoft.com/office/drawing/2015/9/8/chartex" xmlns:cx2="http://schemas.microsoft.com/office/drawing/2015/10/21/chartex" xmlns:cx3="http://schemas.microsoft.com/office/drawing/2016/5/9/chartex" xmlns:cx4="http://schemas.microsoft.com/office/drawing/2016/5/10/chartex" xmlns:cx5="http://schemas.microsoft.com/office/drawing/2016/5/11/chartex" xmlns:cx6="http://schemas.microsoft.com/office/drawing/2016/5/12/chartex" xmlns:cx7="http://schemas.microsoft.com/office/drawing/2016/5/13/chartex" xmlns:cx8="http://schemas.microsoft.com/office/drawing/2016/5/14/chartex" xmlns:mc="http://schemas.openxmlformats.org/markup-compatibility/2006" xmlns:aink="http://schemas.microsoft.com/office/drawing/2016/ink" xmlns:am3d="http://schemas.microsoft.com/office/drawing/2017/model3d" xmlns:o="urn:schemas-microsoft-com:office:office" xmlns:oel="http://schemas.microsoft.com/office/2019/extlst" xmlns:r="http://schemas.openxmlformats.org/officeDocument/2006/relationships" xmlns:m="http://schemas.openxmlformats.org/officeDocument/2006/math" xmlns:v="urn:schemas-microsoft-com:vml" xmlns:wp14="http://schemas.microsoft.com/office/word/2010/wordprocessingDrawing" xmlns:wp="http://schemas.openxmlformats.org/drawingml/2006/wordprocessingDrawing" xmlns:w10="urn:schemas-microsoft-com:office:word" xmlns:w="http://schemas.openxmlformats.org/wordprocessingml/2006/main" xmlns:w14="http://schemas.microsoft.com/office/word/2010/wordml" xmlns:w15="http://schemas.microsoft.com/office/word/2012/wordml" xmlns:w16cex="http://schemas.microsoft.com/office/word/2018/wordml/cex" xmlns:w16cid="http://schemas.microsoft.com/office/word/2016/wordml/cid" xmlns:w16="http://schemas.microsoft.com/office/word/2018/wordml" xmlns:w16sdtdh="http://schemas.microsoft.com/office/word/2020/wordml/sdtdatahash" xmlns:w16se="http://schemas.microsoft.com/office/word/2015/wordml/symex" xmlns:wpg="http://schemas.microsoft.com/office/word/2010/wordprocessingGroup" xmlns:wpi="http://schemas.microsoft.com/office/word/2010/wordprocessingInk" xmlns:wne="http://schemas.microsoft.com/office/word/2006/wordml" xmlns:wps="http://schemas.microsoft.com/office/word/2010/wordprocessingShape" mc:Ignorable="w14 w15 w16se w16cid w16 w16cex w16sdtdh wp14">
+<w:hdr xmlns:wpc="http://schemas.microsoft.com/office/word/2010/wordprocessingCanvas" xmlns:cx="http://schemas.microsoft.com/office/drawing/2014/chartex" xmlns:cx1="http://schemas.microsoft.com/office/drawing/2015/9/8/chartex" xmlns:cx2="http://schemas.microsoft.com/office/drawing/2015/10/21/chartex" xmlns:cx3="http://schemas.microsoft.com/office/drawing/2016/5/9/chartex" xmlns:cx4="http://schemas.microsoft.com/office/drawing/2016/5/10/chartex" xmlns:cx5="http://schemas.microsoft.com/office/drawing/2016/5/11/chartex" xmlns:cx6="http://schemas.microsoft.com/office/drawing/2016/5/12/chartex" xmlns:cx7="http://schemas.microsoft.com/office/drawing/2016/5/13/chartex" xmlns:cx8="http://schemas.microsoft.com/office/drawing/2016/5/14/chartex" xmlns:mc="http://schemas.openxmlformats.org/markup-compatibility/2006" xmlns:aink="http://schemas.microsoft.com/office/drawing/2016/ink" xmlns:am3d="http://schemas.microsoft.com/office/drawing/2017/model3d" xmlns:o="urn:schemas-microsoft-com:office:office" xmlns:oel="http://schemas.microsoft.com/office/2019/extlst" xmlns:r="http://schemas.openxmlformats.org/officeDocument/2006/relationships" xmlns:m="http://schemas.openxmlformats.org/officeDocument/2006/math" xmlns:v="urn:schemas-microsoft-com:vml" xmlns:wp14="http://schemas.microsoft.com/office/word/2010/wordprocessingDrawing" xmlns:wp="http://schemas.openxmlformats.org/drawingml/2006/wordprocessingDrawing" xmlns:w10="urn:schemas-microsoft-com:office:word" xmlns:w="http://schemas.openxmlformats.org/wordprocessingml/2006/main" xmlns:w14="http://schemas.microsoft.com/office/word/2010/wordml" xmlns:w15="http://schemas.microsoft.com/office/word/2012/wordml" xmlns:w16cex="http://schemas.microsoft.com/office/word/2018/wordml/cex" xmlns:w16cid="http://schemas.microsoft.com/office/word/2016/wordml/cid" xmlns:w16="http://schemas.microsoft.com/office/word/2018/wordml" xmlns:w16du="http://schemas.microsoft.com/office/word/2023/wordml/word16du" xmlns:w16sdtdh="http://schemas.microsoft.com/office/word/2020/wordml/sdtdatahash" xmlns:w16sdtfl="http://schemas.microsoft.com/office/word/2024/wordml/sdtformatlock" xmlns:w16se="http://schemas.microsoft.com/office/word/2015/wordml/symex" xmlns:wpg="http://schemas.microsoft.com/office/word/2010/wordprocessingGroup" xmlns:wpi="http://schemas.microsoft.com/office/word/2010/wordprocessingInk" xmlns:wne="http://schemas.microsoft.com/office/word/2006/wordml" xmlns:wps="http://schemas.microsoft.com/office/word/2010/wordprocessingShape" mc:Ignorable="w14 w15 w16se w16cid w16 w16cex w16sdtdh w16sdtfl w16du wp14">
   <w:p>
     <w:pPr>
       <w:pStyle w:val="Header"/>
@@ -44273,7 +44696,7 @@
 </file>
 
 <file path=word/styles.xml><?xml version="1.0" encoding="utf-8"?>
-<w:styles xmlns:mc="http://schemas.openxmlformats.org/markup-compatibility/2006" xmlns:r="http://schemas.openxmlformats.org/officeDocument/2006/relationships" xmlns:w="http://schemas.openxmlformats.org/wordprocessingml/2006/main" xmlns:w14="http://schemas.microsoft.com/office/word/2010/wordml" xmlns:w15="http://schemas.microsoft.com/office/word/2012/wordml" xmlns:w16cex="http://schemas.microsoft.com/office/word/2018/wordml/cex" xmlns:w16cid="http://schemas.microsoft.com/office/word/2016/wordml/cid" xmlns:w16="http://schemas.microsoft.com/office/word/2018/wordml" xmlns:w16sdtdh="http://schemas.microsoft.com/office/word/2020/wordml/sdtdatahash" xmlns:w16se="http://schemas.microsoft.com/office/word/2015/wordml/symex" mc:Ignorable="w14 w15 w16se w16cid w16 w16cex w16sdtdh">
+<w:styles xmlns:mc="http://schemas.openxmlformats.org/markup-compatibility/2006" xmlns:r="http://schemas.openxmlformats.org/officeDocument/2006/relationships" xmlns:w="http://schemas.openxmlformats.org/wordprocessingml/2006/main" xmlns:w14="http://schemas.microsoft.com/office/word/2010/wordml" xmlns:w15="http://schemas.microsoft.com/office/word/2012/wordml" xmlns:w16cex="http://schemas.microsoft.com/office/word/2018/wordml/cex" xmlns:w16cid="http://schemas.microsoft.com/office/word/2016/wordml/cid" xmlns:w16="http://schemas.microsoft.com/office/word/2018/wordml" xmlns:w16du="http://schemas.microsoft.com/office/word/2023/wordml/word16du" xmlns:w16sdtdh="http://schemas.microsoft.com/office/word/2020/wordml/sdtdatahash" xmlns:w16sdtfl="http://schemas.microsoft.com/office/word/2024/wordml/sdtformatlock" xmlns:w16se="http://schemas.microsoft.com/office/word/2015/wordml/symex" mc:Ignorable="w14 w15 w16se w16cid w16 w16cex w16sdtdh w16sdtfl w16du">
   <w:docDefaults>
     <w:rPrDefault>
       <w:rPr>

</xml_diff>

<commit_message>
nmv 28 07 2026
</commit_message>
<xml_diff>
--- a/TS Jatai Ghanam Project/TS 2.2/TS 2.2 Ghanam Malayalam Corrections.docx
+++ b/TS Jatai Ghanam Project/TS 2.2/TS 2.2 Ghanam Malayalam Corrections.docx
@@ -283,45 +283,6 @@
         </w:rPr>
         <w:t>================</w:t>
       </w:r>
-    </w:p>
-    <w:p>
-      <w:pPr>
-        <w:spacing w:before="0" w:line="240" w:lineRule="auto"/>
-        <w:jc w:val="center"/>
-        <w:rPr>
-          <w:b/>
-          <w:bCs/>
-          <w:sz w:val="32"/>
-          <w:szCs w:val="32"/>
-          <w:u w:val="single"/>
-        </w:rPr>
-      </w:pPr>
-    </w:p>
-    <w:p>
-      <w:pPr>
-        <w:spacing w:before="0" w:line="240" w:lineRule="auto"/>
-        <w:jc w:val="center"/>
-        <w:rPr>
-          <w:b/>
-          <w:bCs/>
-          <w:sz w:val="32"/>
-          <w:szCs w:val="32"/>
-          <w:u w:val="single"/>
-        </w:rPr>
-      </w:pPr>
-    </w:p>
-    <w:p>
-      <w:pPr>
-        <w:spacing w:before="0" w:line="240" w:lineRule="auto"/>
-        <w:jc w:val="center"/>
-        <w:rPr>
-          <w:b/>
-          <w:bCs/>
-          <w:sz w:val="32"/>
-          <w:szCs w:val="32"/>
-          <w:u w:val="single"/>
-        </w:rPr>
-      </w:pPr>
     </w:p>
     <w:p>
       <w:pPr>
@@ -1929,18 +1890,7 @@
                 <w:szCs w:val="40"/>
                 <w:lang w:val="it-IT"/>
               </w:rPr>
-              <w:t>¥öeªYx—</w:t>
-            </w:r>
-            <w:r>
-              <w:rPr>
-                <w:rFonts w:ascii="BRH Malayalam Extra" w:hAnsi="BRH Malayalam Extra" w:cs="BRH Malayalam Extra"/>
-                <w:color w:val="000000"/>
-                <w:sz w:val="32"/>
-                <w:szCs w:val="40"/>
-                <w:lang w:val="it-IT"/>
-              </w:rPr>
-              <w:lastRenderedPageBreak/>
-              <w:t>dy ¥öe</w:t>
+              <w:t>¥öeªYx—dy ¥öe</w:t>
             </w:r>
             <w:r>
               <w:rPr>
@@ -2123,6 +2073,7 @@
                 <w:szCs w:val="40"/>
                 <w:lang w:val="it-IT"/>
               </w:rPr>
+              <w:lastRenderedPageBreak/>
               <w:t>5</w:t>
             </w:r>
             <w:r>
@@ -3649,7 +3600,6 @@
                 <w:szCs w:val="40"/>
                 <w:highlight w:val="green"/>
               </w:rPr>
-              <w:lastRenderedPageBreak/>
               <w:t>s</w:t>
             </w:r>
             <w:r>
@@ -3856,6 +3806,7 @@
                 <w:color w:val="000000"/>
                 <w:szCs w:val="40"/>
               </w:rPr>
+              <w:lastRenderedPageBreak/>
               <w:t>5</w:t>
             </w:r>
             <w:r>
@@ -3959,27 +3910,7 @@
                 <w:sz w:val="32"/>
                 <w:szCs w:val="40"/>
               </w:rPr>
-              <w:t>)</w:t>
-            </w:r>
-            <w:proofErr w:type="gramStart"/>
-            <w:r>
-              <w:rPr>
-                <w:rFonts w:ascii="BRH Malayalam Extra" w:hAnsi="BRH Malayalam Extra" w:cs="BRH Malayalam Extra"/>
-                <w:color w:val="000000"/>
-                <w:sz w:val="32"/>
-                <w:szCs w:val="40"/>
-              </w:rPr>
-              <w:t>-  ¥</w:t>
-            </w:r>
-            <w:proofErr w:type="gramEnd"/>
-            <w:r>
-              <w:rPr>
-                <w:rFonts w:ascii="BRH Malayalam Extra" w:hAnsi="BRH Malayalam Extra" w:cs="BRH Malayalam Extra"/>
-                <w:color w:val="000000"/>
-                <w:sz w:val="32"/>
-                <w:szCs w:val="40"/>
-              </w:rPr>
-              <w:t>öe</w:t>
+              <w:t>)-  ¥öe</w:t>
             </w:r>
             <w:r>
               <w:rPr>
@@ -4643,19 +4574,8 @@
                 <w:sz w:val="32"/>
                 <w:szCs w:val="40"/>
               </w:rPr>
-              <w:t>)</w:t>
-            </w:r>
-            <w:proofErr w:type="gramStart"/>
-            <w:r>
-              <w:rPr>
-                <w:rFonts w:ascii="BRH Malayalam Extra" w:hAnsi="BRH Malayalam Extra" w:cs="BRH Malayalam Extra"/>
-                <w:color w:val="000000"/>
-                <w:sz w:val="32"/>
-                <w:szCs w:val="40"/>
-              </w:rPr>
-              <w:t>-  sI</w:t>
-            </w:r>
-            <w:proofErr w:type="gramEnd"/>
+              <w:t>)-  sI</w:t>
+            </w:r>
             <w:r>
               <w:rPr>
                 <w:rFonts w:ascii="BRH Malayalam Extra" w:hAnsi="BRH Malayalam Extra" w:cs="BRH Malayalam Extra"/>
@@ -5215,19 +5135,8 @@
                 <w:sz w:val="32"/>
                 <w:szCs w:val="40"/>
               </w:rPr>
-              <w:t>)</w:t>
-            </w:r>
-            <w:proofErr w:type="gramStart"/>
-            <w:r>
-              <w:rPr>
-                <w:rFonts w:ascii="BRH Malayalam Extra" w:hAnsi="BRH Malayalam Extra" w:cs="BRH Malayalam Extra"/>
-                <w:color w:val="000000"/>
-                <w:sz w:val="32"/>
-                <w:szCs w:val="40"/>
-              </w:rPr>
-              <w:t>-  jx</w:t>
-            </w:r>
-            <w:proofErr w:type="gramEnd"/>
+              <w:t>)-  jx</w:t>
+            </w:r>
             <w:r>
               <w:rPr>
                 <w:rFonts w:ascii="BRH Malayalam Extra" w:hAnsi="BRH Malayalam Extra" w:cs="BRH Malayalam Extra"/>
@@ -5633,7 +5542,6 @@
                 <w:sz w:val="32"/>
                 <w:szCs w:val="40"/>
               </w:rPr>
-              <w:lastRenderedPageBreak/>
               <w:t>id—dûpPx</w:t>
             </w:r>
             <w:r>
@@ -5788,27 +5696,7 @@
                 <w:sz w:val="32"/>
                 <w:szCs w:val="40"/>
               </w:rPr>
-              <w:t>)</w:t>
-            </w:r>
-            <w:proofErr w:type="gramStart"/>
-            <w:r>
-              <w:rPr>
-                <w:rFonts w:ascii="BRH Malayalam Extra" w:hAnsi="BRH Malayalam Extra" w:cs="BRH Malayalam Extra"/>
-                <w:color w:val="000000"/>
-                <w:sz w:val="32"/>
-                <w:szCs w:val="40"/>
-              </w:rPr>
-              <w:t>-  k</w:t>
-            </w:r>
-            <w:proofErr w:type="gramEnd"/>
-            <w:r>
-              <w:rPr>
-                <w:rFonts w:ascii="BRH Malayalam Extra" w:hAnsi="BRH Malayalam Extra" w:cs="BRH Malayalam Extra"/>
-                <w:color w:val="000000"/>
-                <w:sz w:val="32"/>
-                <w:szCs w:val="40"/>
-              </w:rPr>
-              <w:t>±—sxI | Ad—dûpPx</w:t>
+              <w:t>)-  k±—sxI | Ad—dûpPx</w:t>
             </w:r>
             <w:r>
               <w:rPr>
@@ -5860,6 +5748,7 @@
                 <w:sz w:val="32"/>
                 <w:szCs w:val="40"/>
               </w:rPr>
+              <w:lastRenderedPageBreak/>
               <w:t>k</w:t>
             </w:r>
             <w:r>
@@ -6448,27 +6337,7 @@
                 <w:sz w:val="32"/>
                 <w:szCs w:val="40"/>
               </w:rPr>
-              <w:t>)</w:t>
-            </w:r>
-            <w:proofErr w:type="gramStart"/>
-            <w:r>
-              <w:rPr>
-                <w:rFonts w:ascii="BRH Malayalam Extra" w:hAnsi="BRH Malayalam Extra" w:cs="BRH Malayalam Extra"/>
-                <w:color w:val="000000"/>
-                <w:sz w:val="32"/>
-                <w:szCs w:val="40"/>
-              </w:rPr>
-              <w:t>-  Ad</w:t>
-            </w:r>
-            <w:proofErr w:type="gramEnd"/>
-            <w:r>
-              <w:rPr>
-                <w:rFonts w:ascii="BRH Malayalam Extra" w:hAnsi="BRH Malayalam Extra" w:cs="BRH Malayalam Extra"/>
-                <w:color w:val="000000"/>
-                <w:sz w:val="32"/>
-                <w:szCs w:val="40"/>
-              </w:rPr>
-              <w:t>—dûpPx</w:t>
+              <w:t>)-  Ad—dûpPx</w:t>
             </w:r>
             <w:r>
               <w:rPr>
@@ -7113,27 +6982,7 @@
                 <w:sz w:val="32"/>
                 <w:szCs w:val="40"/>
               </w:rPr>
-              <w:t>)</w:t>
-            </w:r>
-            <w:proofErr w:type="gramStart"/>
-            <w:r>
-              <w:rPr>
-                <w:rFonts w:ascii="BRH Malayalam Extra" w:hAnsi="BRH Malayalam Extra" w:cs="BRH Malayalam Extra"/>
-                <w:color w:val="000000"/>
-                <w:sz w:val="32"/>
-                <w:szCs w:val="40"/>
-              </w:rPr>
-              <w:t>-  Ad</w:t>
-            </w:r>
-            <w:proofErr w:type="gramEnd"/>
-            <w:r>
-              <w:rPr>
-                <w:rFonts w:ascii="BRH Malayalam Extra" w:hAnsi="BRH Malayalam Extra" w:cs="BRH Malayalam Extra"/>
-                <w:color w:val="000000"/>
-                <w:sz w:val="32"/>
-                <w:szCs w:val="40"/>
-              </w:rPr>
-              <w:t>—dûpPx</w:t>
+              <w:t>)-  Ad—dûpPx</w:t>
             </w:r>
             <w:r>
               <w:rPr>
@@ -7439,19 +7288,8 @@
                 <w:sz w:val="32"/>
                 <w:szCs w:val="40"/>
               </w:rPr>
-              <w:t>)</w:t>
-            </w:r>
-            <w:proofErr w:type="gramStart"/>
-            <w:r>
-              <w:rPr>
-                <w:rFonts w:ascii="BRH Malayalam Extra" w:hAnsi="BRH Malayalam Extra" w:cs="BRH Malayalam Extra"/>
-                <w:color w:val="000000"/>
-                <w:sz w:val="32"/>
-                <w:szCs w:val="40"/>
-              </w:rPr>
-              <w:t>-  jx</w:t>
-            </w:r>
-            <w:proofErr w:type="gramEnd"/>
+              <w:t>)-  jx</w:t>
+            </w:r>
             <w:r>
               <w:rPr>
                 <w:rFonts w:ascii="BRH Malayalam Extra" w:hAnsi="BRH Malayalam Extra" w:cs="BRH Malayalam Extra"/>
@@ -7838,7 +7676,6 @@
                 <w:sz w:val="32"/>
                 <w:szCs w:val="40"/>
               </w:rPr>
-              <w:lastRenderedPageBreak/>
               <w:t>id—dûpPx</w:t>
             </w:r>
             <w:r>
@@ -7984,27 +7821,7 @@
                 <w:sz w:val="32"/>
                 <w:szCs w:val="40"/>
               </w:rPr>
-              <w:t>)</w:t>
-            </w:r>
-            <w:proofErr w:type="gramStart"/>
-            <w:r>
-              <w:rPr>
-                <w:rFonts w:ascii="BRH Malayalam Extra" w:hAnsi="BRH Malayalam Extra" w:cs="BRH Malayalam Extra"/>
-                <w:color w:val="000000"/>
-                <w:sz w:val="32"/>
-                <w:szCs w:val="40"/>
-              </w:rPr>
-              <w:t>-  k</w:t>
-            </w:r>
-            <w:proofErr w:type="gramEnd"/>
-            <w:r>
-              <w:rPr>
-                <w:rFonts w:ascii="BRH Malayalam Extra" w:hAnsi="BRH Malayalam Extra" w:cs="BRH Malayalam Extra"/>
-                <w:color w:val="000000"/>
-                <w:sz w:val="32"/>
-                <w:szCs w:val="40"/>
-              </w:rPr>
-              <w:t>±—sxI | Ad—dûpPx</w:t>
+              <w:t>)-  k±—sxI | Ad—dûpPx</w:t>
             </w:r>
             <w:r>
               <w:rPr>
@@ -8047,6 +7864,7 @@
                 <w:sz w:val="32"/>
                 <w:szCs w:val="40"/>
               </w:rPr>
+              <w:lastRenderedPageBreak/>
               <w:t>k</w:t>
             </w:r>
             <w:r>
@@ -8575,27 +8393,7 @@
                 <w:sz w:val="32"/>
                 <w:szCs w:val="40"/>
               </w:rPr>
-              <w:t>)</w:t>
-            </w:r>
-            <w:proofErr w:type="gramStart"/>
-            <w:r>
-              <w:rPr>
-                <w:rFonts w:ascii="BRH Malayalam Extra" w:hAnsi="BRH Malayalam Extra" w:cs="BRH Malayalam Extra"/>
-                <w:color w:val="000000"/>
-                <w:sz w:val="32"/>
-                <w:szCs w:val="40"/>
-              </w:rPr>
-              <w:t>-  Ad</w:t>
-            </w:r>
-            <w:proofErr w:type="gramEnd"/>
-            <w:r>
-              <w:rPr>
-                <w:rFonts w:ascii="BRH Malayalam Extra" w:hAnsi="BRH Malayalam Extra" w:cs="BRH Malayalam Extra"/>
-                <w:color w:val="000000"/>
-                <w:sz w:val="32"/>
-                <w:szCs w:val="40"/>
-              </w:rPr>
-              <w:t>—dûpPx</w:t>
+              <w:t>)-  Ad—dûpPx</w:t>
             </w:r>
             <w:r>
               <w:rPr>
@@ -9219,27 +9017,7 @@
                 <w:sz w:val="32"/>
                 <w:szCs w:val="40"/>
               </w:rPr>
-              <w:t>)</w:t>
-            </w:r>
-            <w:proofErr w:type="gramStart"/>
-            <w:r>
-              <w:rPr>
-                <w:rFonts w:ascii="BRH Malayalam Extra" w:hAnsi="BRH Malayalam Extra" w:cs="BRH Malayalam Extra"/>
-                <w:color w:val="000000"/>
-                <w:sz w:val="32"/>
-                <w:szCs w:val="40"/>
-              </w:rPr>
-              <w:t>-  Ad</w:t>
-            </w:r>
-            <w:proofErr w:type="gramEnd"/>
-            <w:r>
-              <w:rPr>
-                <w:rFonts w:ascii="BRH Malayalam Extra" w:hAnsi="BRH Malayalam Extra" w:cs="BRH Malayalam Extra"/>
-                <w:color w:val="000000"/>
-                <w:sz w:val="32"/>
-                <w:szCs w:val="40"/>
-              </w:rPr>
-              <w:t>—dûpPx</w:t>
+              <w:t>)-  Ad—dûpPx</w:t>
             </w:r>
             <w:r>
               <w:rPr>
@@ -9541,27 +9319,7 @@
                 <w:sz w:val="32"/>
                 <w:szCs w:val="40"/>
               </w:rPr>
-              <w:t>)</w:t>
-            </w:r>
-            <w:proofErr w:type="gramStart"/>
-            <w:r>
-              <w:rPr>
-                <w:rFonts w:ascii="BRH Malayalam Extra" w:hAnsi="BRH Malayalam Extra" w:cs="BRH Malayalam Extra"/>
-                <w:color w:val="000000"/>
-                <w:sz w:val="32"/>
-                <w:szCs w:val="40"/>
-              </w:rPr>
-              <w:t>-  B</w:t>
-            </w:r>
-            <w:proofErr w:type="gramEnd"/>
-            <w:r>
-              <w:rPr>
-                <w:rFonts w:ascii="BRH Malayalam Extra" w:hAnsi="BRH Malayalam Extra" w:cs="BRH Malayalam Extra"/>
-                <w:color w:val="000000"/>
-                <w:sz w:val="32"/>
-                <w:szCs w:val="40"/>
-              </w:rPr>
-              <w:t xml:space="preserve"> | E</w:t>
+              <w:t>)-  B | E</w:t>
             </w:r>
             <w:r>
               <w:rPr>
@@ -9917,27 +9675,7 @@
                 <w:sz w:val="32"/>
                 <w:szCs w:val="40"/>
               </w:rPr>
-              <w:t>)</w:t>
-            </w:r>
-            <w:proofErr w:type="gramStart"/>
-            <w:r>
-              <w:rPr>
-                <w:rFonts w:ascii="BRH Malayalam Extra" w:hAnsi="BRH Malayalam Extra" w:cs="BRH Malayalam Extra"/>
-                <w:color w:val="000000"/>
-                <w:sz w:val="32"/>
-                <w:szCs w:val="40"/>
-              </w:rPr>
-              <w:t>-  B</w:t>
-            </w:r>
-            <w:proofErr w:type="gramEnd"/>
-            <w:r>
-              <w:rPr>
-                <w:rFonts w:ascii="BRH Malayalam Extra" w:hAnsi="BRH Malayalam Extra" w:cs="BRH Malayalam Extra"/>
-                <w:color w:val="000000"/>
-                <w:sz w:val="32"/>
-                <w:szCs w:val="40"/>
-              </w:rPr>
-              <w:t xml:space="preserve"> | E</w:t>
+              <w:t>)-  B | E</w:t>
             </w:r>
             <w:r>
               <w:rPr>
@@ -15858,29 +15596,7 @@
                 <w:szCs w:val="40"/>
                 <w:lang w:val="en-IN"/>
               </w:rPr>
-              <w:t>)</w:t>
-            </w:r>
-            <w:proofErr w:type="gramStart"/>
-            <w:r>
-              <w:rPr>
-                <w:rFonts w:ascii="BRH Malayalam Extra" w:hAnsi="BRH Malayalam Extra" w:cs="BRH Malayalam Extra"/>
-                <w:color w:val="000000"/>
-                <w:sz w:val="32"/>
-                <w:szCs w:val="40"/>
-                <w:lang w:val="en-IN"/>
-              </w:rPr>
-              <w:t>-  Z</w:t>
-            </w:r>
-            <w:proofErr w:type="gramEnd"/>
-            <w:r>
-              <w:rPr>
-                <w:rFonts w:ascii="BRH Malayalam Extra" w:hAnsi="BRH Malayalam Extra" w:cs="BRH Malayalam Extra"/>
-                <w:color w:val="000000"/>
-                <w:sz w:val="32"/>
-                <w:szCs w:val="40"/>
-                <w:lang w:val="en-IN"/>
-              </w:rPr>
-              <w:t>¦ | sI</w:t>
+              <w:t>)-  Z¦ | sI</w:t>
             </w:r>
             <w:r>
               <w:rPr>
@@ -17018,27 +16734,7 @@
                 <w:sz w:val="32"/>
                 <w:szCs w:val="40"/>
               </w:rPr>
-              <w:t>)</w:t>
-            </w:r>
-            <w:proofErr w:type="gramStart"/>
-            <w:r>
-              <w:rPr>
-                <w:rFonts w:ascii="BRH Malayalam Extra" w:hAnsi="BRH Malayalam Extra" w:cs="BRH Malayalam Extra"/>
-                <w:color w:val="000000"/>
-                <w:sz w:val="32"/>
-                <w:szCs w:val="40"/>
-              </w:rPr>
-              <w:t>-  B</w:t>
-            </w:r>
-            <w:proofErr w:type="gramEnd"/>
-            <w:r>
-              <w:rPr>
-                <w:rFonts w:ascii="BRH Malayalam Extra" w:hAnsi="BRH Malayalam Extra" w:cs="BRH Malayalam Extra"/>
-                <w:color w:val="000000"/>
-                <w:sz w:val="32"/>
-                <w:szCs w:val="40"/>
-              </w:rPr>
-              <w:t xml:space="preserve"> | E</w:t>
+              <w:t>)-  B | E</w:t>
             </w:r>
             <w:r>
               <w:rPr>
@@ -17400,27 +17096,7 @@
                 <w:sz w:val="32"/>
                 <w:szCs w:val="40"/>
               </w:rPr>
-              <w:t>)</w:t>
-            </w:r>
-            <w:proofErr w:type="gramStart"/>
-            <w:r>
-              <w:rPr>
-                <w:rFonts w:ascii="BRH Malayalam Extra" w:hAnsi="BRH Malayalam Extra" w:cs="BRH Malayalam Extra"/>
-                <w:color w:val="000000"/>
-                <w:sz w:val="32"/>
-                <w:szCs w:val="40"/>
-              </w:rPr>
-              <w:t>-  B</w:t>
-            </w:r>
-            <w:proofErr w:type="gramEnd"/>
-            <w:r>
-              <w:rPr>
-                <w:rFonts w:ascii="BRH Malayalam Extra" w:hAnsi="BRH Malayalam Extra" w:cs="BRH Malayalam Extra"/>
-                <w:color w:val="000000"/>
-                <w:sz w:val="32"/>
-                <w:szCs w:val="40"/>
-              </w:rPr>
-              <w:t xml:space="preserve"> | E</w:t>
+              <w:t>)-  B | E</w:t>
             </w:r>
             <w:r>
               <w:rPr>
@@ -17851,19 +17527,8 @@
                 <w:sz w:val="32"/>
                 <w:szCs w:val="40"/>
               </w:rPr>
-              <w:t>)</w:t>
-            </w:r>
-            <w:proofErr w:type="gramStart"/>
-            <w:r>
-              <w:rPr>
-                <w:rFonts w:ascii="BRH Malayalam Extra" w:hAnsi="BRH Malayalam Extra" w:cs="BRH Malayalam Extra"/>
-                <w:color w:val="000000"/>
-                <w:sz w:val="32"/>
-                <w:szCs w:val="40"/>
-              </w:rPr>
-              <w:t>-  C</w:t>
-            </w:r>
-            <w:proofErr w:type="gramEnd"/>
+              <w:t>)-  C</w:t>
+            </w:r>
             <w:r>
               <w:rPr>
                 <w:rFonts w:ascii="BRH Malayalam Extra" w:hAnsi="BRH Malayalam Extra" w:cs="BRH Malayalam Extra"/>
@@ -18098,19 +17763,8 @@
                 <w:sz w:val="32"/>
                 <w:szCs w:val="40"/>
               </w:rPr>
-              <w:t>)</w:t>
-            </w:r>
-            <w:proofErr w:type="gramStart"/>
-            <w:r>
-              <w:rPr>
-                <w:rFonts w:ascii="BRH Malayalam Extra" w:hAnsi="BRH Malayalam Extra" w:cs="BRH Malayalam Extra"/>
-                <w:color w:val="000000"/>
-                <w:sz w:val="32"/>
-                <w:szCs w:val="40"/>
-              </w:rPr>
-              <w:t>-  C</w:t>
-            </w:r>
-            <w:proofErr w:type="gramEnd"/>
+              <w:t>)-  C</w:t>
+            </w:r>
             <w:r>
               <w:rPr>
                 <w:rFonts w:ascii="BRH Malayalam Extra" w:hAnsi="BRH Malayalam Extra" w:cs="BRH Malayalam Extra"/>
@@ -18356,19 +18010,8 @@
                 <w:sz w:val="32"/>
                 <w:szCs w:val="40"/>
               </w:rPr>
-              <w:t>)</w:t>
-            </w:r>
-            <w:proofErr w:type="gramStart"/>
-            <w:r>
-              <w:rPr>
-                <w:rFonts w:ascii="BRH Malayalam Extra" w:hAnsi="BRH Malayalam Extra" w:cs="BRH Malayalam Extra"/>
-                <w:color w:val="000000"/>
-                <w:sz w:val="32"/>
-                <w:szCs w:val="40"/>
-              </w:rPr>
-              <w:t>-  G</w:t>
-            </w:r>
-            <w:proofErr w:type="gramEnd"/>
+              <w:t>)-  G</w:t>
+            </w:r>
             <w:r>
               <w:rPr>
                 <w:rFonts w:ascii="BRH Malayalam Extra" w:hAnsi="BRH Malayalam Extra" w:cs="BRH Malayalam Extra"/>
@@ -18526,27 +18169,7 @@
                 <w:sz w:val="32"/>
                 <w:szCs w:val="40"/>
               </w:rPr>
-              <w:t xml:space="preserve"> ¤¤p¥pöÉx—jx (³</w:t>
-            </w:r>
-            <w:proofErr w:type="gramStart"/>
-            <w:r>
-              <w:rPr>
-                <w:rFonts w:ascii="BRH Malayalam Extra" w:hAnsi="BRH Malayalam Extra" w:cs="BRH Malayalam Extra"/>
-                <w:color w:val="000000"/>
-                <w:sz w:val="32"/>
-                <w:szCs w:val="40"/>
-              </w:rPr>
-              <w:t>§)¥</w:t>
-            </w:r>
-            <w:proofErr w:type="gramEnd"/>
-            <w:r>
-              <w:rPr>
-                <w:rFonts w:ascii="BRH Malayalam Extra" w:hAnsi="BRH Malayalam Extra" w:cs="BRH Malayalam Extra"/>
-                <w:color w:val="000000"/>
-                <w:sz w:val="32"/>
-                <w:szCs w:val="40"/>
-              </w:rPr>
-              <w:t>tx</w:t>
+              <w:t xml:space="preserve"> ¤¤p¥pöÉx—jx (³§)¥tx</w:t>
             </w:r>
             <w:r>
               <w:rPr>
@@ -18574,20 +18197,8 @@
                 <w:szCs w:val="40"/>
                 <w:highlight w:val="yellow"/>
               </w:rPr>
-              <w:t>¡¥P— „(³</w:t>
-            </w:r>
-            <w:proofErr w:type="gramStart"/>
-            <w:r>
-              <w:rPr>
-                <w:rFonts w:ascii="BRH Malayalam Extra" w:hAnsi="BRH Malayalam Extra" w:cs="BRH Malayalam Extra"/>
-                <w:color w:val="000000"/>
-                <w:sz w:val="32"/>
-                <w:szCs w:val="40"/>
-                <w:highlight w:val="yellow"/>
-              </w:rPr>
-              <w:t>§)¥</w:t>
-            </w:r>
-            <w:proofErr w:type="gramEnd"/>
+              <w:t>¡¥P— „(³§)¥</w:t>
+            </w:r>
             <w:r>
               <w:rPr>
                 <w:rFonts w:ascii="BRH Malayalam Extra" w:hAnsi="BRH Malayalam Extra" w:cs="BRH Malayalam Extra"/>
@@ -18692,27 +18303,7 @@
                 <w:szCs w:val="40"/>
               </w:rPr>
               <w:lastRenderedPageBreak/>
-              <w:t>(³</w:t>
-            </w:r>
-            <w:proofErr w:type="gramStart"/>
-            <w:r>
-              <w:rPr>
-                <w:rFonts w:ascii="BRH Malayalam Extra" w:hAnsi="BRH Malayalam Extra" w:cs="BRH Malayalam Extra"/>
-                <w:color w:val="000000"/>
-                <w:sz w:val="32"/>
-                <w:szCs w:val="40"/>
-              </w:rPr>
-              <w:t>§)¥</w:t>
-            </w:r>
-            <w:proofErr w:type="gramEnd"/>
-            <w:r>
-              <w:rPr>
-                <w:rFonts w:ascii="BRH Malayalam Extra" w:hAnsi="BRH Malayalam Extra" w:cs="BRH Malayalam Extra"/>
-                <w:color w:val="000000"/>
-                <w:sz w:val="32"/>
-                <w:szCs w:val="40"/>
-              </w:rPr>
-              <w:t>tx</w:t>
+              <w:t>(³§)¥tx</w:t>
             </w:r>
             <w:r>
               <w:rPr>
@@ -18856,27 +18447,7 @@
                 <w:sz w:val="32"/>
                 <w:szCs w:val="40"/>
               </w:rPr>
-              <w:t>)</w:t>
-            </w:r>
-            <w:proofErr w:type="gramStart"/>
-            <w:r>
-              <w:rPr>
-                <w:rFonts w:ascii="BRH Malayalam Extra" w:hAnsi="BRH Malayalam Extra" w:cs="BRH Malayalam Extra"/>
-                <w:color w:val="000000"/>
-                <w:sz w:val="32"/>
-                <w:szCs w:val="40"/>
-              </w:rPr>
-              <w:t>-  CöÉx</w:t>
-            </w:r>
-            <w:proofErr w:type="gramEnd"/>
-            <w:r>
-              <w:rPr>
-                <w:rFonts w:ascii="BRH Malayalam Extra" w:hAnsi="BRH Malayalam Extra" w:cs="BRH Malayalam Extra"/>
-                <w:color w:val="000000"/>
-                <w:sz w:val="32"/>
-                <w:szCs w:val="40"/>
-              </w:rPr>
-              <w:t>—j | A</w:t>
+              <w:t>)-  CöÉx—j | A</w:t>
             </w:r>
             <w:r>
               <w:rPr>
@@ -19014,19 +18585,27 @@
                 <w:sz w:val="32"/>
                 <w:szCs w:val="40"/>
               </w:rPr>
-              <w:t>CöÉx—jx (³</w:t>
-            </w:r>
-            <w:proofErr w:type="gramStart"/>
-            <w:r>
-              <w:rPr>
-                <w:rFonts w:ascii="BRH Malayalam Extra" w:hAnsi="BRH Malayalam Extra" w:cs="BRH Malayalam Extra"/>
-                <w:color w:val="000000"/>
-                <w:sz w:val="32"/>
-                <w:szCs w:val="40"/>
-              </w:rPr>
-              <w:t>§)¥</w:t>
-            </w:r>
-            <w:proofErr w:type="gramEnd"/>
+              <w:t>CöÉx—jx (³§)¥tx</w:t>
+            </w:r>
+            <w:r>
+              <w:rPr>
+                <w:rFonts w:ascii="BRH Malayalam Extra" w:hAnsi="BRH Malayalam Extra" w:cs="BRH Malayalam Extra"/>
+                <w:color w:val="000000"/>
+                <w:sz w:val="26"/>
+                <w:szCs w:val="40"/>
+              </w:rPr>
+              <w:t>–</w:t>
+            </w:r>
+            <w:r>
+              <w:rPr>
+                <w:rFonts w:ascii="BRH Malayalam Extra" w:hAnsi="BRH Malayalam Extra" w:cs="BRH Malayalam Extra"/>
+                <w:color w:val="000000"/>
+                <w:sz w:val="32"/>
+                <w:szCs w:val="40"/>
+                <w:highlight w:val="yellow"/>
+              </w:rPr>
+              <w:t>i¡¥P— „(³§)¥</w:t>
+            </w:r>
             <w:r>
               <w:rPr>
                 <w:rFonts w:ascii="BRH Malayalam Extra" w:hAnsi="BRH Malayalam Extra" w:cs="BRH Malayalam Extra"/>
@@ -19051,46 +18630,6 @@
                 <w:color w:val="000000"/>
                 <w:sz w:val="32"/>
                 <w:szCs w:val="40"/>
-                <w:highlight w:val="yellow"/>
-              </w:rPr>
-              <w:t>i¡¥P— „(³</w:t>
-            </w:r>
-            <w:proofErr w:type="gramStart"/>
-            <w:r>
-              <w:rPr>
-                <w:rFonts w:ascii="BRH Malayalam Extra" w:hAnsi="BRH Malayalam Extra" w:cs="BRH Malayalam Extra"/>
-                <w:color w:val="000000"/>
-                <w:sz w:val="32"/>
-                <w:szCs w:val="40"/>
-                <w:highlight w:val="yellow"/>
-              </w:rPr>
-              <w:t>§)¥</w:t>
-            </w:r>
-            <w:proofErr w:type="gramEnd"/>
-            <w:r>
-              <w:rPr>
-                <w:rFonts w:ascii="BRH Malayalam Extra" w:hAnsi="BRH Malayalam Extra" w:cs="BRH Malayalam Extra"/>
-                <w:color w:val="000000"/>
-                <w:sz w:val="32"/>
-                <w:szCs w:val="40"/>
-              </w:rPr>
-              <w:t>tx</w:t>
-            </w:r>
-            <w:r>
-              <w:rPr>
-                <w:rFonts w:ascii="BRH Malayalam Extra" w:hAnsi="BRH Malayalam Extra" w:cs="BRH Malayalam Extra"/>
-                <w:color w:val="000000"/>
-                <w:sz w:val="26"/>
-                <w:szCs w:val="40"/>
-              </w:rPr>
-              <w:t>–</w:t>
-            </w:r>
-            <w:r>
-              <w:rPr>
-                <w:rFonts w:ascii="BRH Malayalam Extra" w:hAnsi="BRH Malayalam Extra" w:cs="BRH Malayalam Extra"/>
-                <w:color w:val="000000"/>
-                <w:sz w:val="32"/>
-                <w:szCs w:val="40"/>
               </w:rPr>
               <w:t>i¡P</w:t>
             </w:r>
@@ -19137,27 +18676,7 @@
                 <w:sz w:val="32"/>
                 <w:szCs w:val="40"/>
               </w:rPr>
-              <w:t>—jx (³</w:t>
-            </w:r>
-            <w:proofErr w:type="gramStart"/>
-            <w:r>
-              <w:rPr>
-                <w:rFonts w:ascii="BRH Malayalam Extra" w:hAnsi="BRH Malayalam Extra" w:cs="BRH Malayalam Extra"/>
-                <w:color w:val="000000"/>
-                <w:sz w:val="32"/>
-                <w:szCs w:val="40"/>
-              </w:rPr>
-              <w:t>§)¥</w:t>
-            </w:r>
-            <w:proofErr w:type="gramEnd"/>
-            <w:r>
-              <w:rPr>
-                <w:rFonts w:ascii="BRH Malayalam Extra" w:hAnsi="BRH Malayalam Extra" w:cs="BRH Malayalam Extra"/>
-                <w:color w:val="000000"/>
-                <w:sz w:val="32"/>
-                <w:szCs w:val="40"/>
-              </w:rPr>
-              <w:t>tx</w:t>
+              <w:t>—jx (³§)¥tx</w:t>
             </w:r>
             <w:r>
               <w:rPr>
@@ -19235,27 +18754,7 @@
                 <w:sz w:val="32"/>
                 <w:szCs w:val="40"/>
               </w:rPr>
-              <w:t>Wxq— i(³</w:t>
-            </w:r>
-            <w:proofErr w:type="gramStart"/>
-            <w:r>
-              <w:rPr>
-                <w:rFonts w:ascii="BRH Malayalam Extra" w:hAnsi="BRH Malayalam Extra" w:cs="BRH Malayalam Extra"/>
-                <w:color w:val="000000"/>
-                <w:sz w:val="32"/>
-                <w:szCs w:val="40"/>
-              </w:rPr>
-              <w:t>§)¥</w:t>
-            </w:r>
-            <w:proofErr w:type="gramEnd"/>
-            <w:r>
-              <w:rPr>
-                <w:rFonts w:ascii="BRH Malayalam Extra" w:hAnsi="BRH Malayalam Extra" w:cs="BRH Malayalam Extra"/>
-                <w:color w:val="000000"/>
-                <w:sz w:val="32"/>
-                <w:szCs w:val="40"/>
-              </w:rPr>
-              <w:t>tx</w:t>
+              <w:t>Wxq— i(³§)¥tx</w:t>
             </w:r>
             <w:r>
               <w:rPr>
@@ -19318,27 +18817,7 @@
                 <w:sz w:val="32"/>
                 <w:szCs w:val="40"/>
               </w:rPr>
-              <w:t>—jx (³</w:t>
-            </w:r>
-            <w:proofErr w:type="gramStart"/>
-            <w:r>
-              <w:rPr>
-                <w:rFonts w:ascii="BRH Malayalam Extra" w:hAnsi="BRH Malayalam Extra" w:cs="BRH Malayalam Extra"/>
-                <w:color w:val="000000"/>
-                <w:sz w:val="32"/>
-                <w:szCs w:val="40"/>
-              </w:rPr>
-              <w:t>§)¥</w:t>
-            </w:r>
-            <w:proofErr w:type="gramEnd"/>
-            <w:r>
-              <w:rPr>
-                <w:rFonts w:ascii="BRH Malayalam Extra" w:hAnsi="BRH Malayalam Extra" w:cs="BRH Malayalam Extra"/>
-                <w:color w:val="000000"/>
-                <w:sz w:val="32"/>
-                <w:szCs w:val="40"/>
-              </w:rPr>
-              <w:t>tx</w:t>
+              <w:t>—jx (³§)¥tx</w:t>
             </w:r>
             <w:r>
               <w:rPr>
@@ -19500,19 +18979,8 @@
                 <w:sz w:val="32"/>
                 <w:szCs w:val="40"/>
               </w:rPr>
-              <w:t>)</w:t>
-            </w:r>
-            <w:proofErr w:type="gramStart"/>
-            <w:r>
-              <w:rPr>
-                <w:rFonts w:ascii="BRH Malayalam Extra" w:hAnsi="BRH Malayalam Extra" w:cs="BRH Malayalam Extra"/>
-                <w:color w:val="000000"/>
-                <w:sz w:val="32"/>
-                <w:szCs w:val="40"/>
-              </w:rPr>
-              <w:t>-  A</w:t>
-            </w:r>
-            <w:proofErr w:type="gramEnd"/>
+              <w:t>)-  A</w:t>
+            </w:r>
             <w:r>
               <w:rPr>
                 <w:rFonts w:ascii="BRH Malayalam Extra" w:hAnsi="BRH Malayalam Extra" w:cs="BRH Malayalam Extra"/>
@@ -19715,27 +19183,7 @@
                 <w:sz w:val="32"/>
                 <w:szCs w:val="40"/>
               </w:rPr>
-              <w:t>Wxq— i(³</w:t>
-            </w:r>
-            <w:proofErr w:type="gramStart"/>
-            <w:r>
-              <w:rPr>
-                <w:rFonts w:ascii="BRH Malayalam Extra" w:hAnsi="BRH Malayalam Extra" w:cs="BRH Malayalam Extra"/>
-                <w:color w:val="000000"/>
-                <w:sz w:val="32"/>
-                <w:szCs w:val="40"/>
-              </w:rPr>
-              <w:t>§)¥</w:t>
-            </w:r>
-            <w:proofErr w:type="gramEnd"/>
-            <w:r>
-              <w:rPr>
-                <w:rFonts w:ascii="BRH Malayalam Extra" w:hAnsi="BRH Malayalam Extra" w:cs="BRH Malayalam Extra"/>
-                <w:color w:val="000000"/>
-                <w:sz w:val="32"/>
-                <w:szCs w:val="40"/>
-              </w:rPr>
-              <w:t>tx</w:t>
+              <w:t>Wxq— i(³§)¥tx</w:t>
             </w:r>
             <w:r>
               <w:rPr>
@@ -19763,20 +19211,8 @@
                 <w:szCs w:val="40"/>
                 <w:highlight w:val="yellow"/>
               </w:rPr>
-              <w:t>¡¥P— „(³</w:t>
-            </w:r>
-            <w:proofErr w:type="gramStart"/>
-            <w:r>
-              <w:rPr>
-                <w:rFonts w:ascii="BRH Malayalam Extra" w:hAnsi="BRH Malayalam Extra" w:cs="BRH Malayalam Extra"/>
-                <w:color w:val="000000"/>
-                <w:sz w:val="32"/>
-                <w:szCs w:val="40"/>
-                <w:highlight w:val="yellow"/>
-              </w:rPr>
-              <w:t>§)¥</w:t>
-            </w:r>
-            <w:proofErr w:type="gramEnd"/>
+              <w:t>¡¥P— „(³§)¥</w:t>
+            </w:r>
             <w:r>
               <w:rPr>
                 <w:rFonts w:ascii="BRH Malayalam Extra" w:hAnsi="BRH Malayalam Extra" w:cs="BRH Malayalam Extra"/>
@@ -19898,27 +19334,7 @@
                 <w:sz w:val="32"/>
                 <w:szCs w:val="40"/>
               </w:rPr>
-              <w:t>Wxq— i(³</w:t>
-            </w:r>
-            <w:proofErr w:type="gramStart"/>
-            <w:r>
-              <w:rPr>
-                <w:rFonts w:ascii="BRH Malayalam Extra" w:hAnsi="BRH Malayalam Extra" w:cs="BRH Malayalam Extra"/>
-                <w:color w:val="000000"/>
-                <w:sz w:val="32"/>
-                <w:szCs w:val="40"/>
-              </w:rPr>
-              <w:t>§)¥</w:t>
-            </w:r>
-            <w:proofErr w:type="gramEnd"/>
-            <w:r>
-              <w:rPr>
-                <w:rFonts w:ascii="BRH Malayalam Extra" w:hAnsi="BRH Malayalam Extra" w:cs="BRH Malayalam Extra"/>
-                <w:color w:val="000000"/>
-                <w:sz w:val="32"/>
-                <w:szCs w:val="40"/>
-              </w:rPr>
-              <w:t>tx</w:t>
+              <w:t>Wxq— i(³§)¥tx</w:t>
             </w:r>
             <w:r>
               <w:rPr>
@@ -19967,25 +19383,14 @@
               </w:rPr>
               <w:t>„(³</w:t>
             </w:r>
-            <w:proofErr w:type="gramStart"/>
-            <w:r>
-              <w:rPr>
-                <w:rFonts w:ascii="BRH Malayalam Extra" w:hAnsi="BRH Malayalam Extra" w:cs="BRH Malayalam Extra"/>
-                <w:color w:val="000000"/>
-                <w:sz w:val="32"/>
-                <w:szCs w:val="40"/>
-              </w:rPr>
-              <w:t>§)¥</w:t>
-            </w:r>
-            <w:proofErr w:type="gramEnd"/>
-            <w:r>
-              <w:rPr>
-                <w:rFonts w:ascii="BRH Malayalam Extra" w:hAnsi="BRH Malayalam Extra" w:cs="BRH Malayalam Extra"/>
-                <w:color w:val="000000"/>
-                <w:sz w:val="32"/>
-                <w:szCs w:val="40"/>
-              </w:rPr>
-              <w:t>tx</w:t>
+            <w:r>
+              <w:rPr>
+                <w:rFonts w:ascii="BRH Malayalam Extra" w:hAnsi="BRH Malayalam Extra" w:cs="BRH Malayalam Extra"/>
+                <w:color w:val="000000"/>
+                <w:sz w:val="32"/>
+                <w:szCs w:val="40"/>
+              </w:rPr>
+              <w:t>§)¥tx</w:t>
             </w:r>
             <w:r>
               <w:rPr>
@@ -20194,19 +19599,8 @@
                 <w:sz w:val="32"/>
                 <w:szCs w:val="40"/>
               </w:rPr>
-              <w:t>)</w:t>
-            </w:r>
-            <w:proofErr w:type="gramStart"/>
-            <w:r>
-              <w:rPr>
-                <w:rFonts w:ascii="BRH Malayalam Extra" w:hAnsi="BRH Malayalam Extra" w:cs="BRH Malayalam Extra"/>
-                <w:color w:val="000000"/>
-                <w:sz w:val="32"/>
-                <w:szCs w:val="40"/>
-              </w:rPr>
-              <w:t>-  G</w:t>
-            </w:r>
-            <w:proofErr w:type="gramEnd"/>
+              <w:t>)-  G</w:t>
+            </w:r>
             <w:r>
               <w:rPr>
                 <w:rFonts w:ascii="BRH Malayalam Extra" w:hAnsi="BRH Malayalam Extra" w:cs="BRH Malayalam Extra"/>
@@ -20364,27 +19758,7 @@
                 <w:sz w:val="32"/>
                 <w:szCs w:val="40"/>
               </w:rPr>
-              <w:t xml:space="preserve"> ¤¤p¥pöÉx—jx (³</w:t>
-            </w:r>
-            <w:proofErr w:type="gramStart"/>
-            <w:r>
-              <w:rPr>
-                <w:rFonts w:ascii="BRH Malayalam Extra" w:hAnsi="BRH Malayalam Extra" w:cs="BRH Malayalam Extra"/>
-                <w:color w:val="000000"/>
-                <w:sz w:val="32"/>
-                <w:szCs w:val="40"/>
-              </w:rPr>
-              <w:t>§)¥</w:t>
-            </w:r>
-            <w:proofErr w:type="gramEnd"/>
-            <w:r>
-              <w:rPr>
-                <w:rFonts w:ascii="BRH Malayalam Extra" w:hAnsi="BRH Malayalam Extra" w:cs="BRH Malayalam Extra"/>
-                <w:color w:val="000000"/>
-                <w:sz w:val="32"/>
-                <w:szCs w:val="40"/>
-              </w:rPr>
-              <w:t>tx</w:t>
+              <w:t xml:space="preserve"> ¤¤p¥pöÉx—jx (³§)¥tx</w:t>
             </w:r>
             <w:r>
               <w:rPr>
@@ -20527,27 +19901,7 @@
                 <w:szCs w:val="40"/>
               </w:rPr>
               <w:lastRenderedPageBreak/>
-              <w:t>(³</w:t>
-            </w:r>
-            <w:proofErr w:type="gramStart"/>
-            <w:r>
-              <w:rPr>
-                <w:rFonts w:ascii="BRH Malayalam Extra" w:hAnsi="BRH Malayalam Extra" w:cs="BRH Malayalam Extra"/>
-                <w:color w:val="000000"/>
-                <w:sz w:val="32"/>
-                <w:szCs w:val="40"/>
-              </w:rPr>
-              <w:t>§)¥</w:t>
-            </w:r>
-            <w:proofErr w:type="gramEnd"/>
-            <w:r>
-              <w:rPr>
-                <w:rFonts w:ascii="BRH Malayalam Extra" w:hAnsi="BRH Malayalam Extra" w:cs="BRH Malayalam Extra"/>
-                <w:color w:val="000000"/>
-                <w:sz w:val="32"/>
-                <w:szCs w:val="40"/>
-              </w:rPr>
-              <w:t>tx</w:t>
+              <w:t>(³§)¥tx</w:t>
             </w:r>
             <w:r>
               <w:rPr>
@@ -20691,27 +20045,7 @@
                 <w:sz w:val="32"/>
                 <w:szCs w:val="40"/>
               </w:rPr>
-              <w:t>)</w:t>
-            </w:r>
-            <w:proofErr w:type="gramStart"/>
-            <w:r>
-              <w:rPr>
-                <w:rFonts w:ascii="BRH Malayalam Extra" w:hAnsi="BRH Malayalam Extra" w:cs="BRH Malayalam Extra"/>
-                <w:color w:val="000000"/>
-                <w:sz w:val="32"/>
-                <w:szCs w:val="40"/>
-              </w:rPr>
-              <w:t>-  CöÉx</w:t>
-            </w:r>
-            <w:proofErr w:type="gramEnd"/>
-            <w:r>
-              <w:rPr>
-                <w:rFonts w:ascii="BRH Malayalam Extra" w:hAnsi="BRH Malayalam Extra" w:cs="BRH Malayalam Extra"/>
-                <w:color w:val="000000"/>
-                <w:sz w:val="32"/>
-                <w:szCs w:val="40"/>
-              </w:rPr>
-              <w:t>—j | A</w:t>
+              <w:t>)-  CöÉx—j | A</w:t>
             </w:r>
             <w:r>
               <w:rPr>
@@ -20825,27 +20159,7 @@
                 <w:sz w:val="32"/>
                 <w:szCs w:val="40"/>
               </w:rPr>
-              <w:t>CöÉx—jx (³</w:t>
-            </w:r>
-            <w:proofErr w:type="gramStart"/>
-            <w:r>
-              <w:rPr>
-                <w:rFonts w:ascii="BRH Malayalam Extra" w:hAnsi="BRH Malayalam Extra" w:cs="BRH Malayalam Extra"/>
-                <w:color w:val="000000"/>
-                <w:sz w:val="32"/>
-                <w:szCs w:val="40"/>
-              </w:rPr>
-              <w:t>§)¥</w:t>
-            </w:r>
-            <w:proofErr w:type="gramEnd"/>
-            <w:r>
-              <w:rPr>
-                <w:rFonts w:ascii="BRH Malayalam Extra" w:hAnsi="BRH Malayalam Extra" w:cs="BRH Malayalam Extra"/>
-                <w:color w:val="000000"/>
-                <w:sz w:val="32"/>
-                <w:szCs w:val="40"/>
-              </w:rPr>
-              <w:t>tx</w:t>
+              <w:t>CöÉx—jx (³§)¥tx</w:t>
             </w:r>
             <w:r>
               <w:rPr>
@@ -20969,27 +20283,7 @@
                 <w:sz w:val="32"/>
                 <w:szCs w:val="40"/>
               </w:rPr>
-              <w:t>—jx (³</w:t>
-            </w:r>
-            <w:proofErr w:type="gramStart"/>
-            <w:r>
-              <w:rPr>
-                <w:rFonts w:ascii="BRH Malayalam Extra" w:hAnsi="BRH Malayalam Extra" w:cs="BRH Malayalam Extra"/>
-                <w:color w:val="000000"/>
-                <w:sz w:val="32"/>
-                <w:szCs w:val="40"/>
-              </w:rPr>
-              <w:t>§)¥</w:t>
-            </w:r>
-            <w:proofErr w:type="gramEnd"/>
-            <w:r>
-              <w:rPr>
-                <w:rFonts w:ascii="BRH Malayalam Extra" w:hAnsi="BRH Malayalam Extra" w:cs="BRH Malayalam Extra"/>
-                <w:color w:val="000000"/>
-                <w:sz w:val="32"/>
-                <w:szCs w:val="40"/>
-              </w:rPr>
-              <w:t>tx</w:t>
+              <w:t>—jx (³§)¥tx</w:t>
             </w:r>
             <w:r>
               <w:rPr>
@@ -21067,27 +20361,7 @@
                 <w:sz w:val="32"/>
                 <w:szCs w:val="40"/>
               </w:rPr>
-              <w:t>Wxq— i(³</w:t>
-            </w:r>
-            <w:proofErr w:type="gramStart"/>
-            <w:r>
-              <w:rPr>
-                <w:rFonts w:ascii="BRH Malayalam Extra" w:hAnsi="BRH Malayalam Extra" w:cs="BRH Malayalam Extra"/>
-                <w:color w:val="000000"/>
-                <w:sz w:val="32"/>
-                <w:szCs w:val="40"/>
-              </w:rPr>
-              <w:t>§)¥</w:t>
-            </w:r>
-            <w:proofErr w:type="gramEnd"/>
-            <w:r>
-              <w:rPr>
-                <w:rFonts w:ascii="BRH Malayalam Extra" w:hAnsi="BRH Malayalam Extra" w:cs="BRH Malayalam Extra"/>
-                <w:color w:val="000000"/>
-                <w:sz w:val="32"/>
-                <w:szCs w:val="40"/>
-              </w:rPr>
-              <w:t>tx</w:t>
+              <w:t>Wxq— i(³§)¥tx</w:t>
             </w:r>
             <w:r>
               <w:rPr>
@@ -21174,27 +20448,7 @@
                 <w:sz w:val="32"/>
                 <w:szCs w:val="40"/>
               </w:rPr>
-              <w:t>³</w:t>
-            </w:r>
-            <w:proofErr w:type="gramStart"/>
-            <w:r>
-              <w:rPr>
-                <w:rFonts w:ascii="BRH Malayalam Extra" w:hAnsi="BRH Malayalam Extra" w:cs="BRH Malayalam Extra"/>
-                <w:color w:val="000000"/>
-                <w:sz w:val="32"/>
-                <w:szCs w:val="40"/>
-              </w:rPr>
-              <w:t>§)¥</w:t>
-            </w:r>
-            <w:proofErr w:type="gramEnd"/>
-            <w:r>
-              <w:rPr>
-                <w:rFonts w:ascii="BRH Malayalam Extra" w:hAnsi="BRH Malayalam Extra" w:cs="BRH Malayalam Extra"/>
-                <w:color w:val="000000"/>
-                <w:sz w:val="32"/>
-                <w:szCs w:val="40"/>
-              </w:rPr>
-              <w:t>tx</w:t>
+              <w:t>³§)¥tx</w:t>
             </w:r>
             <w:r>
               <w:rPr>
@@ -21356,19 +20610,8 @@
                 <w:sz w:val="32"/>
                 <w:szCs w:val="40"/>
               </w:rPr>
-              <w:t>)</w:t>
-            </w:r>
-            <w:proofErr w:type="gramStart"/>
-            <w:r>
-              <w:rPr>
-                <w:rFonts w:ascii="BRH Malayalam Extra" w:hAnsi="BRH Malayalam Extra" w:cs="BRH Malayalam Extra"/>
-                <w:color w:val="000000"/>
-                <w:sz w:val="32"/>
-                <w:szCs w:val="40"/>
-              </w:rPr>
-              <w:t>-  A</w:t>
-            </w:r>
-            <w:proofErr w:type="gramEnd"/>
+              <w:t>)-  A</w:t>
+            </w:r>
             <w:r>
               <w:rPr>
                 <w:rFonts w:ascii="BRH Malayalam Extra" w:hAnsi="BRH Malayalam Extra" w:cs="BRH Malayalam Extra"/>
@@ -21571,27 +20814,7 @@
                 <w:sz w:val="32"/>
                 <w:szCs w:val="40"/>
               </w:rPr>
-              <w:t>Wxq— i(³</w:t>
-            </w:r>
-            <w:proofErr w:type="gramStart"/>
-            <w:r>
-              <w:rPr>
-                <w:rFonts w:ascii="BRH Malayalam Extra" w:hAnsi="BRH Malayalam Extra" w:cs="BRH Malayalam Extra"/>
-                <w:color w:val="000000"/>
-                <w:sz w:val="32"/>
-                <w:szCs w:val="40"/>
-              </w:rPr>
-              <w:t>§)¥</w:t>
-            </w:r>
-            <w:proofErr w:type="gramEnd"/>
-            <w:r>
-              <w:rPr>
-                <w:rFonts w:ascii="BRH Malayalam Extra" w:hAnsi="BRH Malayalam Extra" w:cs="BRH Malayalam Extra"/>
-                <w:color w:val="000000"/>
-                <w:sz w:val="32"/>
-                <w:szCs w:val="40"/>
-              </w:rPr>
-              <w:t>tx</w:t>
+              <w:t>Wxq— i(³§)¥tx</w:t>
             </w:r>
             <w:r>
               <w:rPr>
@@ -21742,27 +20965,7 @@
                 <w:sz w:val="32"/>
                 <w:szCs w:val="40"/>
               </w:rPr>
-              <w:t>Wxq— i(³</w:t>
-            </w:r>
-            <w:proofErr w:type="gramStart"/>
-            <w:r>
-              <w:rPr>
-                <w:rFonts w:ascii="BRH Malayalam Extra" w:hAnsi="BRH Malayalam Extra" w:cs="BRH Malayalam Extra"/>
-                <w:color w:val="000000"/>
-                <w:sz w:val="32"/>
-                <w:szCs w:val="40"/>
-              </w:rPr>
-              <w:t>§)¥</w:t>
-            </w:r>
-            <w:proofErr w:type="gramEnd"/>
-            <w:r>
-              <w:rPr>
-                <w:rFonts w:ascii="BRH Malayalam Extra" w:hAnsi="BRH Malayalam Extra" w:cs="BRH Malayalam Extra"/>
-                <w:color w:val="000000"/>
-                <w:sz w:val="32"/>
-                <w:szCs w:val="40"/>
-              </w:rPr>
-              <w:t>tx</w:t>
+              <w:t>Wxq— i(³§)¥tx</w:t>
             </w:r>
             <w:r>
               <w:rPr>
@@ -22056,20 +21259,8 @@
                 <w:szCs w:val="40"/>
                 <w:lang w:val="en-IN"/>
               </w:rPr>
-              <w:t>)</w:t>
-            </w:r>
-            <w:proofErr w:type="gramStart"/>
-            <w:r>
-              <w:rPr>
-                <w:rFonts w:ascii="BRH Malayalam Extra" w:hAnsi="BRH Malayalam Extra" w:cs="BRH Malayalam Extra"/>
-                <w:color w:val="000000"/>
-                <w:sz w:val="32"/>
-                <w:szCs w:val="40"/>
-                <w:lang w:val="en-IN"/>
-              </w:rPr>
-              <w:t>-  G</w:t>
-            </w:r>
-            <w:proofErr w:type="gramEnd"/>
+              <w:t>)-  G</w:t>
+            </w:r>
             <w:r>
               <w:rPr>
                 <w:rFonts w:ascii="BRH Malayalam Extra" w:hAnsi="BRH Malayalam Extra" w:cs="BRH Malayalam Extra"/>
@@ -22269,29 +21460,7 @@
                 <w:szCs w:val="40"/>
                 <w:lang w:val="en-IN"/>
               </w:rPr>
-              <w:t>i¡P— i(³</w:t>
-            </w:r>
-            <w:proofErr w:type="gramStart"/>
-            <w:r>
-              <w:rPr>
-                <w:rFonts w:ascii="BRH Malayalam Extra" w:hAnsi="BRH Malayalam Extra" w:cs="BRH Malayalam Extra"/>
-                <w:color w:val="000000"/>
-                <w:sz w:val="32"/>
-                <w:szCs w:val="40"/>
-                <w:lang w:val="en-IN"/>
-              </w:rPr>
-              <w:t>§)¥</w:t>
-            </w:r>
-            <w:proofErr w:type="gramEnd"/>
-            <w:r>
-              <w:rPr>
-                <w:rFonts w:ascii="BRH Malayalam Extra" w:hAnsi="BRH Malayalam Extra" w:cs="BRH Malayalam Extra"/>
-                <w:color w:val="000000"/>
-                <w:sz w:val="32"/>
-                <w:szCs w:val="40"/>
-                <w:lang w:val="en-IN"/>
-              </w:rPr>
-              <w:t>tx</w:t>
+              <w:t>i¡P— i(³§)¥tx</w:t>
             </w:r>
             <w:r>
               <w:rPr>
@@ -22723,20 +21892,8 @@
                 <w:szCs w:val="40"/>
                 <w:lang w:val="en-IN"/>
               </w:rPr>
-              <w:t>)</w:t>
-            </w:r>
-            <w:proofErr w:type="gramStart"/>
-            <w:r>
-              <w:rPr>
-                <w:rFonts w:ascii="BRH Malayalam Extra" w:hAnsi="BRH Malayalam Extra" w:cs="BRH Malayalam Extra"/>
-                <w:color w:val="000000"/>
-                <w:sz w:val="32"/>
-                <w:szCs w:val="40"/>
-                <w:lang w:val="en-IN"/>
-              </w:rPr>
-              <w:t>-  G</w:t>
-            </w:r>
-            <w:proofErr w:type="gramEnd"/>
+              <w:t>)-  G</w:t>
+            </w:r>
             <w:r>
               <w:rPr>
                 <w:rFonts w:ascii="BRH Malayalam Extra" w:hAnsi="BRH Malayalam Extra" w:cs="BRH Malayalam Extra"/>
@@ -22862,72 +22019,37 @@
                 <w:highlight w:val="green"/>
                 <w:lang w:val="en-IN"/>
               </w:rPr>
-              <w:t>px(³</w:t>
-            </w:r>
-            <w:proofErr w:type="gramStart"/>
-            <w:r>
-              <w:rPr>
-                <w:rFonts w:ascii="BRH Malayalam Extra" w:hAnsi="BRH Malayalam Extra" w:cs="BRH Malayalam Extra"/>
-                <w:color w:val="000000"/>
-                <w:sz w:val="32"/>
-                <w:szCs w:val="40"/>
-                <w:highlight w:val="green"/>
+              <w:t>px(³§)¥</w:t>
+            </w:r>
+            <w:r>
+              <w:rPr>
+                <w:rFonts w:ascii="BRH Malayalam Extra" w:hAnsi="BRH Malayalam Extra" w:cs="BRH Malayalam Extra"/>
+                <w:color w:val="000000"/>
+                <w:sz w:val="32"/>
+                <w:szCs w:val="40"/>
                 <w:lang w:val="en-IN"/>
               </w:rPr>
-              <w:t>§)¥</w:t>
-            </w:r>
-            <w:proofErr w:type="gramEnd"/>
-            <w:r>
-              <w:rPr>
-                <w:rFonts w:ascii="BRH Malayalam Extra" w:hAnsi="BRH Malayalam Extra" w:cs="BRH Malayalam Extra"/>
-                <w:color w:val="000000"/>
-                <w:sz w:val="32"/>
+              <w:t>tx</w:t>
+            </w:r>
+            <w:r>
+              <w:rPr>
+                <w:rFonts w:ascii="BRH Malayalam Extra" w:hAnsi="BRH Malayalam Extra" w:cs="BRH Malayalam Extra"/>
+                <w:color w:val="000000"/>
+                <w:sz w:val="26"/>
                 <w:szCs w:val="40"/>
                 <w:lang w:val="en-IN"/>
               </w:rPr>
-              <w:t>tx</w:t>
-            </w:r>
-            <w:r>
-              <w:rPr>
-                <w:rFonts w:ascii="BRH Malayalam Extra" w:hAnsi="BRH Malayalam Extra" w:cs="BRH Malayalam Extra"/>
-                <w:color w:val="000000"/>
-                <w:sz w:val="26"/>
+              <w:t>–</w:t>
+            </w:r>
+            <w:r>
+              <w:rPr>
+                <w:rFonts w:ascii="BRH Malayalam Extra" w:hAnsi="BRH Malayalam Extra" w:cs="BRH Malayalam Extra"/>
+                <w:color w:val="000000"/>
+                <w:sz w:val="32"/>
                 <w:szCs w:val="40"/>
                 <w:lang w:val="en-IN"/>
               </w:rPr>
-              <w:t>–</w:t>
-            </w:r>
-            <w:r>
-              <w:rPr>
-                <w:rFonts w:ascii="BRH Malayalam Extra" w:hAnsi="BRH Malayalam Extra" w:cs="BRH Malayalam Extra"/>
-                <w:color w:val="000000"/>
-                <w:sz w:val="32"/>
-                <w:szCs w:val="40"/>
-                <w:lang w:val="en-IN"/>
-              </w:rPr>
-              <w:t>i¡P— i(³</w:t>
-            </w:r>
-            <w:proofErr w:type="gramStart"/>
-            <w:r>
-              <w:rPr>
-                <w:rFonts w:ascii="BRH Malayalam Extra" w:hAnsi="BRH Malayalam Extra" w:cs="BRH Malayalam Extra"/>
-                <w:color w:val="000000"/>
-                <w:sz w:val="32"/>
-                <w:szCs w:val="40"/>
-                <w:lang w:val="en-IN"/>
-              </w:rPr>
-              <w:t>§)¥</w:t>
-            </w:r>
-            <w:proofErr w:type="gramEnd"/>
-            <w:r>
-              <w:rPr>
-                <w:rFonts w:ascii="BRH Malayalam Extra" w:hAnsi="BRH Malayalam Extra" w:cs="BRH Malayalam Extra"/>
-                <w:color w:val="000000"/>
-                <w:sz w:val="32"/>
-                <w:szCs w:val="40"/>
-                <w:lang w:val="en-IN"/>
-              </w:rPr>
-              <w:t>tx</w:t>
+              <w:t>i¡P— i(³§)¥tx</w:t>
             </w:r>
             <w:r>
               <w:rPr>
@@ -23162,7 +22284,6 @@
               </w:rPr>
               <w:t>³</w:t>
             </w:r>
-            <w:proofErr w:type="gramStart"/>
             <w:r>
               <w:rPr>
                 <w:rFonts w:ascii="BRH Malayalam Extra" w:hAnsi="BRH Malayalam Extra" w:cs="BRH Malayalam Extra"/>
@@ -23171,18 +22292,7 @@
                 <w:szCs w:val="40"/>
                 <w:lang w:val="en-IN"/>
               </w:rPr>
-              <w:t>§)¥</w:t>
-            </w:r>
-            <w:proofErr w:type="gramEnd"/>
-            <w:r>
-              <w:rPr>
-                <w:rFonts w:ascii="BRH Malayalam Extra" w:hAnsi="BRH Malayalam Extra" w:cs="BRH Malayalam Extra"/>
-                <w:color w:val="000000"/>
-                <w:sz w:val="32"/>
-                <w:szCs w:val="40"/>
-                <w:lang w:val="en-IN"/>
-              </w:rPr>
-              <w:t>tx</w:t>
+              <w:t>§)¥tx</w:t>
             </w:r>
             <w:r>
               <w:rPr>
@@ -23375,17 +22485,7 @@
                 <w:sz w:val="32"/>
                 <w:szCs w:val="40"/>
               </w:rPr>
-              <w:t>)</w:t>
-            </w:r>
-            <w:proofErr w:type="gramStart"/>
-            <w:r>
-              <w:rPr>
-                <w:rFonts w:ascii="BRH Malayalam Extra" w:hAnsi="BRH Malayalam Extra" w:cs="BRH Malayalam Extra"/>
-                <w:color w:val="000000"/>
-                <w:sz w:val="32"/>
-                <w:szCs w:val="40"/>
-              </w:rPr>
-              <w:t xml:space="preserve">-  </w:t>
+              <w:t xml:space="preserve">)-  </w:t>
             </w:r>
             <w:r>
               <w:rPr>
@@ -23397,7 +22497,6 @@
               </w:rPr>
               <w:t>C</w:t>
             </w:r>
-            <w:proofErr w:type="gramEnd"/>
             <w:r>
               <w:rPr>
                 <w:rFonts w:ascii="BRH Malayalam Extra" w:hAnsi="BRH Malayalam Extra" w:cs="BRH Malayalam Extra"/>
@@ -23950,17 +23049,7 @@
                 <w:sz w:val="32"/>
                 <w:szCs w:val="40"/>
               </w:rPr>
-              <w:t>)</w:t>
-            </w:r>
-            <w:proofErr w:type="gramStart"/>
-            <w:r>
-              <w:rPr>
-                <w:rFonts w:ascii="BRH Malayalam Extra" w:hAnsi="BRH Malayalam Extra" w:cs="BRH Malayalam Extra"/>
-                <w:color w:val="000000"/>
-                <w:sz w:val="32"/>
-                <w:szCs w:val="40"/>
-              </w:rPr>
-              <w:t xml:space="preserve">-  </w:t>
+              <w:t xml:space="preserve">)-  </w:t>
             </w:r>
             <w:r>
               <w:rPr>
@@ -23979,17 +23068,7 @@
                 <w:sz w:val="32"/>
                 <w:szCs w:val="40"/>
               </w:rPr>
-              <w:t>öÉx</w:t>
-            </w:r>
-            <w:proofErr w:type="gramEnd"/>
-            <w:r>
-              <w:rPr>
-                <w:rFonts w:ascii="BRH Malayalam Extra" w:hAnsi="BRH Malayalam Extra" w:cs="BRH Malayalam Extra"/>
-                <w:color w:val="000000"/>
-                <w:sz w:val="32"/>
-                <w:szCs w:val="40"/>
-              </w:rPr>
-              <w:t xml:space="preserve">—j | Adû£—R¥p | </w:t>
+              <w:t xml:space="preserve">öÉx—j | Adû£—R¥p | </w:t>
             </w:r>
           </w:p>
           <w:p>
@@ -24517,19 +23596,8 @@
                 <w:sz w:val="32"/>
                 <w:szCs w:val="40"/>
               </w:rPr>
-              <w:t>)</w:t>
-            </w:r>
-            <w:proofErr w:type="gramStart"/>
-            <w:r>
-              <w:rPr>
-                <w:rFonts w:ascii="BRH Malayalam Extra" w:hAnsi="BRH Malayalam Extra" w:cs="BRH Malayalam Extra"/>
-                <w:color w:val="000000"/>
-                <w:sz w:val="32"/>
-                <w:szCs w:val="40"/>
-              </w:rPr>
-              <w:t>-  e</w:t>
-            </w:r>
-            <w:proofErr w:type="gramEnd"/>
+              <w:t>)-  e</w:t>
+            </w:r>
             <w:r>
               <w:rPr>
                 <w:rFonts w:ascii="BRH Malayalam Extra" w:hAnsi="BRH Malayalam Extra" w:cs="BRH Malayalam Extra"/>
@@ -24774,19 +23842,8 @@
                 <w:sz w:val="32"/>
                 <w:szCs w:val="40"/>
               </w:rPr>
-              <w:t>hõx</w:t>
-            </w:r>
-            <w:proofErr w:type="gramStart"/>
-            <w:r>
-              <w:rPr>
-                <w:rFonts w:ascii="BRH Malayalam Extra" w:hAnsi="BRH Malayalam Extra" w:cs="BRH Malayalam Extra"/>
-                <w:color w:val="000000"/>
-                <w:sz w:val="32"/>
-                <w:szCs w:val="40"/>
-              </w:rPr>
-              <w:t>˜(</w:t>
-            </w:r>
-            <w:proofErr w:type="gramEnd"/>
+              <w:t>hõx˜(</w:t>
+            </w:r>
             <w:r>
               <w:rPr>
                 <w:rFonts w:cs="BRH Malayalam Extra"/>
@@ -24795,34 +23852,23 @@
               </w:rPr>
               <w:t>1</w:t>
             </w:r>
-            <w:proofErr w:type="gramStart"/>
-            <w:r>
-              <w:rPr>
-                <w:rFonts w:ascii="BRH Malayalam Extra" w:hAnsi="BRH Malayalam Extra" w:cs="BRH Malayalam Extra"/>
-                <w:color w:val="000000"/>
-                <w:sz w:val="26"/>
-                <w:szCs w:val="40"/>
-              </w:rPr>
-              <w:t>–</w:t>
-            </w:r>
-            <w:r>
-              <w:rPr>
-                <w:rFonts w:ascii="BRH Malayalam Extra" w:hAnsi="BRH Malayalam Extra" w:cs="BRH Malayalam Extra"/>
-                <w:color w:val="000000"/>
-                <w:sz w:val="32"/>
-                <w:szCs w:val="40"/>
-              </w:rPr>
-              <w:t>)hõ</w:t>
-            </w:r>
-            <w:proofErr w:type="gramEnd"/>
-            <w:r>
-              <w:rPr>
-                <w:rFonts w:ascii="BRH Malayalam Extra" w:hAnsi="BRH Malayalam Extra" w:cs="BRH Malayalam Extra"/>
-                <w:color w:val="000000"/>
-                <w:sz w:val="32"/>
-                <w:szCs w:val="40"/>
-              </w:rPr>
-              <w:t>—</w:t>
+            <w:r>
+              <w:rPr>
+                <w:rFonts w:ascii="BRH Malayalam Extra" w:hAnsi="BRH Malayalam Extra" w:cs="BRH Malayalam Extra"/>
+                <w:color w:val="000000"/>
+                <w:sz w:val="26"/>
+                <w:szCs w:val="40"/>
+              </w:rPr>
+              <w:t>–</w:t>
+            </w:r>
+            <w:r>
+              <w:rPr>
+                <w:rFonts w:ascii="BRH Malayalam Extra" w:hAnsi="BRH Malayalam Extra" w:cs="BRH Malayalam Extra"/>
+                <w:color w:val="000000"/>
+                <w:sz w:val="32"/>
+                <w:szCs w:val="40"/>
+              </w:rPr>
+              <w:t>)hõ—</w:t>
             </w:r>
             <w:r>
               <w:rPr>
@@ -25063,19 +24109,8 @@
                 <w:sz w:val="32"/>
                 <w:szCs w:val="40"/>
               </w:rPr>
-              <w:t>)</w:t>
-            </w:r>
-            <w:proofErr w:type="gramStart"/>
-            <w:r>
-              <w:rPr>
-                <w:rFonts w:ascii="BRH Malayalam Extra" w:hAnsi="BRH Malayalam Extra" w:cs="BRH Malayalam Extra"/>
-                <w:color w:val="000000"/>
-                <w:sz w:val="32"/>
-                <w:szCs w:val="40"/>
-              </w:rPr>
-              <w:t>-  A</w:t>
-            </w:r>
-            <w:proofErr w:type="gramEnd"/>
+              <w:t>)-  A</w:t>
+            </w:r>
             <w:r>
               <w:rPr>
                 <w:rFonts w:ascii="BRH Malayalam Extra" w:hAnsi="BRH Malayalam Extra" w:cs="BRH Malayalam Extra"/>
@@ -25262,19 +24297,8 @@
                 <w:sz w:val="32"/>
                 <w:szCs w:val="40"/>
               </w:rPr>
-              <w:t>hõx</w:t>
-            </w:r>
-            <w:proofErr w:type="gramStart"/>
-            <w:r>
-              <w:rPr>
-                <w:rFonts w:ascii="BRH Malayalam Extra" w:hAnsi="BRH Malayalam Extra" w:cs="BRH Malayalam Extra"/>
-                <w:color w:val="000000"/>
-                <w:sz w:val="32"/>
-                <w:szCs w:val="40"/>
-              </w:rPr>
-              <w:t>˜(</w:t>
-            </w:r>
-            <w:proofErr w:type="gramEnd"/>
+              <w:t>hõx˜(</w:t>
+            </w:r>
             <w:r>
               <w:rPr>
                 <w:rFonts w:cs="BRH Malayalam Extra"/>
@@ -25283,34 +24307,23 @@
               </w:rPr>
               <w:t>1</w:t>
             </w:r>
-            <w:proofErr w:type="gramStart"/>
-            <w:r>
-              <w:rPr>
-                <w:rFonts w:ascii="BRH Malayalam Extra" w:hAnsi="BRH Malayalam Extra" w:cs="BRH Malayalam Extra"/>
-                <w:color w:val="000000"/>
-                <w:sz w:val="26"/>
-                <w:szCs w:val="40"/>
-              </w:rPr>
-              <w:t>–</w:t>
-            </w:r>
-            <w:r>
-              <w:rPr>
-                <w:rFonts w:ascii="BRH Malayalam Extra" w:hAnsi="BRH Malayalam Extra" w:cs="BRH Malayalam Extra"/>
-                <w:color w:val="000000"/>
-                <w:sz w:val="32"/>
-                <w:szCs w:val="40"/>
-              </w:rPr>
-              <w:t>)hõ</w:t>
-            </w:r>
-            <w:proofErr w:type="gramEnd"/>
-            <w:r>
-              <w:rPr>
-                <w:rFonts w:ascii="BRH Malayalam Extra" w:hAnsi="BRH Malayalam Extra" w:cs="BRH Malayalam Extra"/>
-                <w:color w:val="000000"/>
-                <w:sz w:val="32"/>
-                <w:szCs w:val="40"/>
-              </w:rPr>
-              <w:t>—</w:t>
+            <w:r>
+              <w:rPr>
+                <w:rFonts w:ascii="BRH Malayalam Extra" w:hAnsi="BRH Malayalam Extra" w:cs="BRH Malayalam Extra"/>
+                <w:color w:val="000000"/>
+                <w:sz w:val="26"/>
+                <w:szCs w:val="40"/>
+              </w:rPr>
+              <w:t>–</w:t>
+            </w:r>
+            <w:r>
+              <w:rPr>
+                <w:rFonts w:ascii="BRH Malayalam Extra" w:hAnsi="BRH Malayalam Extra" w:cs="BRH Malayalam Extra"/>
+                <w:color w:val="000000"/>
+                <w:sz w:val="32"/>
+                <w:szCs w:val="40"/>
+              </w:rPr>
+              <w:t>)hõ—</w:t>
             </w:r>
             <w:r>
               <w:rPr>
@@ -25569,19 +24582,8 @@
                 <w:sz w:val="32"/>
                 <w:szCs w:val="40"/>
               </w:rPr>
-              <w:t>)</w:t>
-            </w:r>
-            <w:proofErr w:type="gramStart"/>
-            <w:r>
-              <w:rPr>
-                <w:rFonts w:ascii="BRH Malayalam Extra" w:hAnsi="BRH Malayalam Extra" w:cs="BRH Malayalam Extra"/>
-                <w:color w:val="000000"/>
-                <w:sz w:val="32"/>
-                <w:szCs w:val="40"/>
-              </w:rPr>
-              <w:t>-  e</w:t>
-            </w:r>
-            <w:proofErr w:type="gramEnd"/>
+              <w:t>)-  e</w:t>
+            </w:r>
             <w:r>
               <w:rPr>
                 <w:rFonts w:ascii="BRH Malayalam Extra" w:hAnsi="BRH Malayalam Extra" w:cs="BRH Malayalam Extra"/>
@@ -25826,19 +24828,8 @@
                 <w:sz w:val="32"/>
                 <w:szCs w:val="40"/>
               </w:rPr>
-              <w:t>hõx</w:t>
-            </w:r>
-            <w:proofErr w:type="gramStart"/>
-            <w:r>
-              <w:rPr>
-                <w:rFonts w:ascii="BRH Malayalam Extra" w:hAnsi="BRH Malayalam Extra" w:cs="BRH Malayalam Extra"/>
-                <w:color w:val="000000"/>
-                <w:sz w:val="32"/>
-                <w:szCs w:val="40"/>
-              </w:rPr>
-              <w:t>˜(</w:t>
-            </w:r>
-            <w:proofErr w:type="gramEnd"/>
+              <w:t>hõx˜(</w:t>
+            </w:r>
             <w:r>
               <w:rPr>
                 <w:rFonts w:cs="BRH Malayalam Extra"/>
@@ -25847,34 +24838,23 @@
               </w:rPr>
               <w:t>1</w:t>
             </w:r>
-            <w:proofErr w:type="gramStart"/>
-            <w:r>
-              <w:rPr>
-                <w:rFonts w:ascii="BRH Malayalam Extra" w:hAnsi="BRH Malayalam Extra" w:cs="BRH Malayalam Extra"/>
-                <w:color w:val="000000"/>
-                <w:sz w:val="26"/>
-                <w:szCs w:val="40"/>
-              </w:rPr>
-              <w:t>–</w:t>
-            </w:r>
-            <w:r>
-              <w:rPr>
-                <w:rFonts w:ascii="BRH Malayalam Extra" w:hAnsi="BRH Malayalam Extra" w:cs="BRH Malayalam Extra"/>
-                <w:color w:val="000000"/>
-                <w:sz w:val="32"/>
-                <w:szCs w:val="40"/>
-              </w:rPr>
-              <w:t>)hõ</w:t>
-            </w:r>
-            <w:proofErr w:type="gramEnd"/>
-            <w:r>
-              <w:rPr>
-                <w:rFonts w:ascii="BRH Malayalam Extra" w:hAnsi="BRH Malayalam Extra" w:cs="BRH Malayalam Extra"/>
-                <w:color w:val="000000"/>
-                <w:sz w:val="32"/>
-                <w:szCs w:val="40"/>
-              </w:rPr>
-              <w:t>—</w:t>
+            <w:r>
+              <w:rPr>
+                <w:rFonts w:ascii="BRH Malayalam Extra" w:hAnsi="BRH Malayalam Extra" w:cs="BRH Malayalam Extra"/>
+                <w:color w:val="000000"/>
+                <w:sz w:val="26"/>
+                <w:szCs w:val="40"/>
+              </w:rPr>
+              <w:t>–</w:t>
+            </w:r>
+            <w:r>
+              <w:rPr>
+                <w:rFonts w:ascii="BRH Malayalam Extra" w:hAnsi="BRH Malayalam Extra" w:cs="BRH Malayalam Extra"/>
+                <w:color w:val="000000"/>
+                <w:sz w:val="32"/>
+                <w:szCs w:val="40"/>
+              </w:rPr>
+              <w:t>)hõ—</w:t>
             </w:r>
             <w:r>
               <w:rPr>
@@ -26124,19 +25104,8 @@
                 <w:sz w:val="32"/>
                 <w:szCs w:val="40"/>
               </w:rPr>
-              <w:t>)</w:t>
-            </w:r>
-            <w:proofErr w:type="gramStart"/>
-            <w:r>
-              <w:rPr>
-                <w:rFonts w:ascii="BRH Malayalam Extra" w:hAnsi="BRH Malayalam Extra" w:cs="BRH Malayalam Extra"/>
-                <w:color w:val="000000"/>
-                <w:sz w:val="32"/>
-                <w:szCs w:val="40"/>
-              </w:rPr>
-              <w:t>-  A</w:t>
-            </w:r>
-            <w:proofErr w:type="gramEnd"/>
+              <w:t>)-  A</w:t>
+            </w:r>
             <w:r>
               <w:rPr>
                 <w:rFonts w:ascii="BRH Malayalam Extra" w:hAnsi="BRH Malayalam Extra" w:cs="BRH Malayalam Extra"/>
@@ -26321,19 +25290,8 @@
                 <w:sz w:val="32"/>
                 <w:szCs w:val="40"/>
               </w:rPr>
-              <w:t>hõx</w:t>
-            </w:r>
-            <w:proofErr w:type="gramStart"/>
-            <w:r>
-              <w:rPr>
-                <w:rFonts w:ascii="BRH Malayalam Extra" w:hAnsi="BRH Malayalam Extra" w:cs="BRH Malayalam Extra"/>
-                <w:color w:val="000000"/>
-                <w:sz w:val="32"/>
-                <w:szCs w:val="40"/>
-              </w:rPr>
-              <w:t>˜(</w:t>
-            </w:r>
-            <w:proofErr w:type="gramEnd"/>
+              <w:t>hõx˜(</w:t>
+            </w:r>
             <w:r>
               <w:rPr>
                 <w:rFonts w:cs="BRH Malayalam Extra"/>
@@ -26342,7 +25300,6 @@
               </w:rPr>
               <w:t>1</w:t>
             </w:r>
-            <w:proofErr w:type="gramStart"/>
             <w:r>
               <w:rPr>
                 <w:rFonts w:ascii="BRH Malayalam Extra" w:hAnsi="BRH Malayalam Extra" w:cs="BRH Malayalam Extra"/>
@@ -26361,7 +25318,6 @@
               </w:rPr>
               <w:t>)hõ</w:t>
             </w:r>
-            <w:proofErr w:type="gramEnd"/>
             <w:r>
               <w:rPr>
                 <w:rFonts w:ascii="BRH Malayalam Extra" w:hAnsi="BRH Malayalam Extra" w:cs="BRH Malayalam Extra"/>
@@ -26670,27 +25626,7 @@
                 <w:sz w:val="32"/>
                 <w:szCs w:val="40"/>
               </w:rPr>
-              <w:t>)</w:t>
-            </w:r>
-            <w:proofErr w:type="gramStart"/>
-            <w:r>
-              <w:rPr>
-                <w:rFonts w:ascii="BRH Malayalam Extra" w:hAnsi="BRH Malayalam Extra" w:cs="BRH Malayalam Extra"/>
-                <w:color w:val="000000"/>
-                <w:sz w:val="32"/>
-                <w:szCs w:val="40"/>
-              </w:rPr>
-              <w:t>-  B</w:t>
-            </w:r>
-            <w:proofErr w:type="gramEnd"/>
-            <w:r>
-              <w:rPr>
-                <w:rFonts w:ascii="BRH Malayalam Extra" w:hAnsi="BRH Malayalam Extra" w:cs="BRH Malayalam Extra"/>
-                <w:color w:val="000000"/>
-                <w:sz w:val="32"/>
-                <w:szCs w:val="40"/>
-              </w:rPr>
-              <w:t xml:space="preserve"> | E</w:t>
+              <w:t>)-  B | E</w:t>
             </w:r>
             <w:r>
               <w:rPr>
@@ -27109,27 +26045,7 @@
                 <w:sz w:val="32"/>
                 <w:szCs w:val="40"/>
               </w:rPr>
-              <w:t>)</w:t>
-            </w:r>
-            <w:proofErr w:type="gramStart"/>
-            <w:r>
-              <w:rPr>
-                <w:rFonts w:ascii="BRH Malayalam Extra" w:hAnsi="BRH Malayalam Extra" w:cs="BRH Malayalam Extra"/>
-                <w:color w:val="000000"/>
-                <w:sz w:val="32"/>
-                <w:szCs w:val="40"/>
-              </w:rPr>
-              <w:t>-  B</w:t>
-            </w:r>
-            <w:proofErr w:type="gramEnd"/>
-            <w:r>
-              <w:rPr>
-                <w:rFonts w:ascii="BRH Malayalam Extra" w:hAnsi="BRH Malayalam Extra" w:cs="BRH Malayalam Extra"/>
-                <w:color w:val="000000"/>
-                <w:sz w:val="32"/>
-                <w:szCs w:val="40"/>
-              </w:rPr>
-              <w:t xml:space="preserve"> | E</w:t>
+              <w:t>)-  B | E</w:t>
             </w:r>
             <w:r>
               <w:rPr>
@@ -27576,19 +26492,8 @@
                 <w:sz w:val="32"/>
                 <w:szCs w:val="40"/>
               </w:rPr>
-              <w:t>)</w:t>
-            </w:r>
-            <w:proofErr w:type="gramStart"/>
-            <w:r>
-              <w:rPr>
-                <w:rFonts w:ascii="BRH Malayalam Extra" w:hAnsi="BRH Malayalam Extra" w:cs="BRH Malayalam Extra"/>
-                <w:color w:val="000000"/>
-                <w:sz w:val="32"/>
-                <w:szCs w:val="40"/>
-              </w:rPr>
-              <w:t>-  G</w:t>
-            </w:r>
-            <w:proofErr w:type="gramEnd"/>
+              <w:t>)-  G</w:t>
+            </w:r>
             <w:r>
               <w:rPr>
                 <w:rFonts w:ascii="BRH Malayalam Extra" w:hAnsi="BRH Malayalam Extra" w:cs="BRH Malayalam Extra"/>
@@ -28830,18 +27735,8 @@
                 <w:sz w:val="32"/>
                 <w:szCs w:val="40"/>
               </w:rPr>
-              <w:t>)</w:t>
-            </w:r>
-            <w:proofErr w:type="gramStart"/>
-            <w:r>
-              <w:rPr>
-                <w:rFonts w:ascii="BRH Malayalam Extra" w:hAnsi="BRH Malayalam Extra" w:cs="BRH Malayalam Extra"/>
-                <w:sz w:val="32"/>
-                <w:szCs w:val="40"/>
-              </w:rPr>
-              <w:t>-  B</w:t>
-            </w:r>
-            <w:proofErr w:type="gramEnd"/>
+              <w:t>)-  B</w:t>
+            </w:r>
             <w:r>
               <w:rPr>
                 <w:rFonts w:ascii="BRH Malayalam Extra" w:hAnsi="BRH Malayalam Extra" w:cs="BRH Malayalam Extra"/>
@@ -28970,18 +27865,8 @@
                 <w:sz w:val="32"/>
                 <w:szCs w:val="40"/>
               </w:rPr>
-              <w:t>© ¥Z</w:t>
-            </w:r>
-            <w:proofErr w:type="gramStart"/>
-            <w:r>
-              <w:rPr>
-                <w:rFonts w:ascii="BRH Malayalam Extra" w:hAnsi="BRH Malayalam Extra" w:cs="BRH Malayalam Extra"/>
-                <w:sz w:val="32"/>
-                <w:szCs w:val="40"/>
-              </w:rPr>
-              <w:t>˜(</w:t>
-            </w:r>
-            <w:proofErr w:type="gramEnd"/>
+              <w:t>© ¥Z˜(</w:t>
+            </w:r>
             <w:r>
               <w:rPr>
                 <w:rFonts w:cs="BRH Malayalam Extra"/>
@@ -29165,27 +28050,7 @@
                 <w:sz w:val="32"/>
                 <w:szCs w:val="40"/>
               </w:rPr>
-              <w:t>)</w:t>
-            </w:r>
-            <w:proofErr w:type="gramStart"/>
-            <w:r>
-              <w:rPr>
-                <w:rFonts w:ascii="BRH Malayalam Extra" w:hAnsi="BRH Malayalam Extra" w:cs="BRH Malayalam Extra"/>
-                <w:color w:val="000000"/>
-                <w:sz w:val="32"/>
-                <w:szCs w:val="40"/>
-              </w:rPr>
-              <w:t>-  ps</w:t>
-            </w:r>
-            <w:proofErr w:type="gramEnd"/>
-            <w:r>
-              <w:rPr>
-                <w:rFonts w:ascii="BRH Malayalam Extra" w:hAnsi="BRH Malayalam Extra" w:cs="BRH Malayalam Extra"/>
-                <w:color w:val="000000"/>
-                <w:sz w:val="32"/>
-                <w:szCs w:val="40"/>
-              </w:rPr>
-              <w:t>¡—hyJ | ¥sxi—J | k¡</w:t>
+              <w:t>)-  ps¡—hyJ | ¥sxi—J | k¡</w:t>
             </w:r>
             <w:r>
               <w:rPr>
@@ -29615,27 +28480,7 @@
                 <w:sz w:val="32"/>
                 <w:szCs w:val="40"/>
               </w:rPr>
-              <w:t>)</w:t>
-            </w:r>
-            <w:proofErr w:type="gramStart"/>
-            <w:r>
-              <w:rPr>
-                <w:rFonts w:ascii="BRH Malayalam Extra" w:hAnsi="BRH Malayalam Extra" w:cs="BRH Malayalam Extra"/>
-                <w:color w:val="000000"/>
-                <w:sz w:val="32"/>
-                <w:szCs w:val="40"/>
-              </w:rPr>
-              <w:t>-  ¥</w:t>
-            </w:r>
-            <w:proofErr w:type="gramEnd"/>
-            <w:r>
-              <w:rPr>
-                <w:rFonts w:ascii="BRH Malayalam Extra" w:hAnsi="BRH Malayalam Extra" w:cs="BRH Malayalam Extra"/>
-                <w:color w:val="000000"/>
-                <w:sz w:val="32"/>
-                <w:szCs w:val="40"/>
-              </w:rPr>
-              <w:t>sxi—J | k¡</w:t>
+              <w:t>)-  ¥sxi—J | k¡</w:t>
             </w:r>
             <w:r>
               <w:rPr>
@@ -30011,27 +28856,7 @@
                 <w:sz w:val="32"/>
                 <w:szCs w:val="40"/>
               </w:rPr>
-              <w:t>)</w:t>
-            </w:r>
-            <w:proofErr w:type="gramStart"/>
-            <w:r>
-              <w:rPr>
-                <w:rFonts w:ascii="BRH Malayalam Extra" w:hAnsi="BRH Malayalam Extra" w:cs="BRH Malayalam Extra"/>
-                <w:color w:val="000000"/>
-                <w:sz w:val="32"/>
-                <w:szCs w:val="40"/>
-              </w:rPr>
-              <w:t>-  k</w:t>
-            </w:r>
-            <w:proofErr w:type="gramEnd"/>
-            <w:r>
-              <w:rPr>
-                <w:rFonts w:ascii="BRH Malayalam Extra" w:hAnsi="BRH Malayalam Extra" w:cs="BRH Malayalam Extra"/>
-                <w:color w:val="000000"/>
-                <w:sz w:val="32"/>
-                <w:szCs w:val="40"/>
-              </w:rPr>
-              <w:t>¡</w:t>
+              <w:t>)-  k¡</w:t>
             </w:r>
             <w:r>
               <w:rPr>
@@ -30525,27 +29350,7 @@
                 <w:sz w:val="32"/>
                 <w:szCs w:val="40"/>
               </w:rPr>
-              <w:t>)</w:t>
-            </w:r>
-            <w:proofErr w:type="gramStart"/>
-            <w:r>
-              <w:rPr>
-                <w:rFonts w:ascii="BRH Malayalam Extra" w:hAnsi="BRH Malayalam Extra" w:cs="BRH Malayalam Extra"/>
-                <w:color w:val="000000"/>
-                <w:sz w:val="32"/>
-                <w:szCs w:val="40"/>
-              </w:rPr>
-              <w:t>-  ps</w:t>
-            </w:r>
-            <w:proofErr w:type="gramEnd"/>
-            <w:r>
-              <w:rPr>
-                <w:rFonts w:ascii="BRH Malayalam Extra" w:hAnsi="BRH Malayalam Extra" w:cs="BRH Malayalam Extra"/>
-                <w:color w:val="000000"/>
-                <w:sz w:val="32"/>
-                <w:szCs w:val="40"/>
-              </w:rPr>
-              <w:t>¡—hyJ | ¥sxi—J | k¡</w:t>
+              <w:t>)-  ps¡—hyJ | ¥sxi—J | k¡</w:t>
             </w:r>
             <w:r>
               <w:rPr>
@@ -30980,27 +29785,7 @@
                 <w:sz w:val="32"/>
                 <w:szCs w:val="40"/>
               </w:rPr>
-              <w:t>)</w:t>
-            </w:r>
-            <w:proofErr w:type="gramStart"/>
-            <w:r>
-              <w:rPr>
-                <w:rFonts w:ascii="BRH Malayalam Extra" w:hAnsi="BRH Malayalam Extra" w:cs="BRH Malayalam Extra"/>
-                <w:color w:val="000000"/>
-                <w:sz w:val="32"/>
-                <w:szCs w:val="40"/>
-              </w:rPr>
-              <w:t>-  ¥</w:t>
-            </w:r>
-            <w:proofErr w:type="gramEnd"/>
-            <w:r>
-              <w:rPr>
-                <w:rFonts w:ascii="BRH Malayalam Extra" w:hAnsi="BRH Malayalam Extra" w:cs="BRH Malayalam Extra"/>
-                <w:color w:val="000000"/>
-                <w:sz w:val="32"/>
-                <w:szCs w:val="40"/>
-              </w:rPr>
-              <w:t>sxi—J | k¡</w:t>
+              <w:t>)-  ¥sxi—J | k¡</w:t>
             </w:r>
             <w:r>
               <w:rPr>
@@ -31381,27 +30166,7 @@
                 <w:sz w:val="32"/>
                 <w:szCs w:val="40"/>
               </w:rPr>
-              <w:t>)</w:t>
-            </w:r>
-            <w:proofErr w:type="gramStart"/>
-            <w:r>
-              <w:rPr>
-                <w:rFonts w:ascii="BRH Malayalam Extra" w:hAnsi="BRH Malayalam Extra" w:cs="BRH Malayalam Extra"/>
-                <w:color w:val="000000"/>
-                <w:sz w:val="32"/>
-                <w:szCs w:val="40"/>
-              </w:rPr>
-              <w:t>-  k</w:t>
-            </w:r>
-            <w:proofErr w:type="gramEnd"/>
-            <w:r>
-              <w:rPr>
-                <w:rFonts w:ascii="BRH Malayalam Extra" w:hAnsi="BRH Malayalam Extra" w:cs="BRH Malayalam Extra"/>
-                <w:color w:val="000000"/>
-                <w:sz w:val="32"/>
-                <w:szCs w:val="40"/>
-              </w:rPr>
-              <w:t>¡</w:t>
+              <w:t>)-  k¡</w:t>
             </w:r>
             <w:r>
               <w:rPr>
@@ -31859,19 +30624,8 @@
                 <w:sz w:val="32"/>
                 <w:szCs w:val="40"/>
               </w:rPr>
-              <w:t>)</w:t>
-            </w:r>
-            <w:proofErr w:type="gramStart"/>
-            <w:r>
-              <w:rPr>
-                <w:rFonts w:ascii="BRH Malayalam Extra" w:hAnsi="BRH Malayalam Extra" w:cs="BRH Malayalam Extra"/>
-                <w:color w:val="000000"/>
-                <w:sz w:val="32"/>
-                <w:szCs w:val="40"/>
-              </w:rPr>
-              <w:t>-  P</w:t>
-            </w:r>
-            <w:proofErr w:type="gramEnd"/>
+              <w:t>)-  P</w:t>
+            </w:r>
             <w:r>
               <w:rPr>
                 <w:rFonts w:ascii="BRH Malayalam Extra" w:hAnsi="BRH Malayalam Extra" w:cs="BRH Malayalam Extra"/>
@@ -39282,19 +38036,8 @@
                 <w:sz w:val="32"/>
                 <w:szCs w:val="40"/>
               </w:rPr>
-              <w:t>)</w:t>
-            </w:r>
-            <w:proofErr w:type="gramStart"/>
-            <w:r>
-              <w:rPr>
-                <w:rFonts w:ascii="BRH Malayalam Extra" w:hAnsi="BRH Malayalam Extra" w:cs="BRH Malayalam Extra"/>
-                <w:color w:val="000000"/>
-                <w:sz w:val="32"/>
-                <w:szCs w:val="40"/>
-              </w:rPr>
-              <w:t>-  pz</w:t>
-            </w:r>
-            <w:proofErr w:type="gramEnd"/>
+              <w:t>)-  pz</w:t>
+            </w:r>
             <w:r>
               <w:rPr>
                 <w:rFonts w:ascii="BRH Malayalam Extra" w:hAnsi="BRH Malayalam Extra" w:cs="BRH Malayalam Extra"/>
@@ -39647,19 +38390,8 @@
                 <w:sz w:val="32"/>
                 <w:szCs w:val="40"/>
               </w:rPr>
-              <w:t>)</w:t>
-            </w:r>
-            <w:proofErr w:type="gramStart"/>
-            <w:r>
-              <w:rPr>
-                <w:rFonts w:ascii="BRH Malayalam Extra" w:hAnsi="BRH Malayalam Extra" w:cs="BRH Malayalam Extra"/>
-                <w:color w:val="000000"/>
-                <w:sz w:val="32"/>
-                <w:szCs w:val="40"/>
-              </w:rPr>
-              <w:t>-  pz</w:t>
-            </w:r>
-            <w:proofErr w:type="gramEnd"/>
+              <w:t>)-  pz</w:t>
+            </w:r>
             <w:r>
               <w:rPr>
                 <w:rFonts w:ascii="BRH Malayalam Extra" w:hAnsi="BRH Malayalam Extra" w:cs="BRH Malayalam Extra"/>
@@ -40017,27 +38749,7 @@
                 <w:sz w:val="32"/>
                 <w:szCs w:val="40"/>
               </w:rPr>
-              <w:t>)</w:t>
-            </w:r>
-            <w:proofErr w:type="gramStart"/>
-            <w:r>
-              <w:rPr>
-                <w:rFonts w:ascii="BRH Malayalam Extra" w:hAnsi="BRH Malayalam Extra" w:cs="BRH Malayalam Extra"/>
-                <w:color w:val="000000"/>
-                <w:sz w:val="32"/>
-                <w:szCs w:val="40"/>
-              </w:rPr>
-              <w:t>-  öq</w:t>
-            </w:r>
-            <w:proofErr w:type="gramEnd"/>
-            <w:r>
-              <w:rPr>
-                <w:rFonts w:ascii="BRH Malayalam Extra" w:hAnsi="BRH Malayalam Extra" w:cs="BRH Malayalam Extra"/>
-                <w:color w:val="000000"/>
-                <w:sz w:val="32"/>
-                <w:szCs w:val="40"/>
-              </w:rPr>
-              <w:t>¡¤¤Zõ˜ | Ae— | p£</w:t>
+              <w:t>)-  öq¡¤¤Zõ˜ | Ae— | p£</w:t>
             </w:r>
             <w:r>
               <w:rPr>
@@ -40429,27 +39141,7 @@
                 <w:sz w:val="32"/>
                 <w:szCs w:val="40"/>
               </w:rPr>
-              <w:t>)</w:t>
-            </w:r>
-            <w:proofErr w:type="gramStart"/>
-            <w:r>
-              <w:rPr>
-                <w:rFonts w:ascii="BRH Malayalam Extra" w:hAnsi="BRH Malayalam Extra" w:cs="BRH Malayalam Extra"/>
-                <w:color w:val="000000"/>
-                <w:sz w:val="32"/>
-                <w:szCs w:val="40"/>
-              </w:rPr>
-              <w:t>-  Ae</w:t>
-            </w:r>
-            <w:proofErr w:type="gramEnd"/>
-            <w:r>
-              <w:rPr>
-                <w:rFonts w:ascii="BRH Malayalam Extra" w:hAnsi="BRH Malayalam Extra" w:cs="BRH Malayalam Extra"/>
-                <w:color w:val="000000"/>
-                <w:sz w:val="32"/>
-                <w:szCs w:val="40"/>
-              </w:rPr>
-              <w:t>— | p£</w:t>
+              <w:t>)-  Ae— | p£</w:t>
             </w:r>
             <w:r>
               <w:rPr>
@@ -40716,27 +39408,7 @@
                 <w:sz w:val="32"/>
                 <w:szCs w:val="40"/>
               </w:rPr>
-              <w:t>)</w:t>
-            </w:r>
-            <w:proofErr w:type="gramStart"/>
-            <w:r>
-              <w:rPr>
-                <w:rFonts w:ascii="BRH Malayalam Extra" w:hAnsi="BRH Malayalam Extra" w:cs="BRH Malayalam Extra"/>
-                <w:color w:val="000000"/>
-                <w:sz w:val="32"/>
-                <w:szCs w:val="40"/>
-              </w:rPr>
-              <w:t>-  öq</w:t>
-            </w:r>
-            <w:proofErr w:type="gramEnd"/>
-            <w:r>
-              <w:rPr>
-                <w:rFonts w:ascii="BRH Malayalam Extra" w:hAnsi="BRH Malayalam Extra" w:cs="BRH Malayalam Extra"/>
-                <w:color w:val="000000"/>
-                <w:sz w:val="32"/>
-                <w:szCs w:val="40"/>
-              </w:rPr>
-              <w:t>¡¤¤Zõ˜ | Ae— | p£</w:t>
+              <w:t>)-  öq¡¤¤Zõ˜ | Ae— | p£</w:t>
             </w:r>
             <w:r>
               <w:rPr>
@@ -41128,27 +39800,7 @@
                 <w:sz w:val="32"/>
                 <w:szCs w:val="40"/>
               </w:rPr>
-              <w:t>)</w:t>
-            </w:r>
-            <w:proofErr w:type="gramStart"/>
-            <w:r>
-              <w:rPr>
-                <w:rFonts w:ascii="BRH Malayalam Extra" w:hAnsi="BRH Malayalam Extra" w:cs="BRH Malayalam Extra"/>
-                <w:color w:val="000000"/>
-                <w:sz w:val="32"/>
-                <w:szCs w:val="40"/>
-              </w:rPr>
-              <w:t>-  Ae</w:t>
-            </w:r>
-            <w:proofErr w:type="gramEnd"/>
-            <w:r>
-              <w:rPr>
-                <w:rFonts w:ascii="BRH Malayalam Extra" w:hAnsi="BRH Malayalam Extra" w:cs="BRH Malayalam Extra"/>
-                <w:color w:val="000000"/>
-                <w:sz w:val="32"/>
-                <w:szCs w:val="40"/>
-              </w:rPr>
-              <w:t>— | p£</w:t>
+              <w:t>)-  Ae— | p£</w:t>
             </w:r>
             <w:r>
               <w:rPr>
@@ -41421,19 +40073,8 @@
                 <w:sz w:val="32"/>
                 <w:szCs w:val="40"/>
               </w:rPr>
-              <w:t>)</w:t>
-            </w:r>
-            <w:proofErr w:type="gramStart"/>
-            <w:r>
-              <w:rPr>
-                <w:rFonts w:ascii="BRH Malayalam Extra" w:hAnsi="BRH Malayalam Extra" w:cs="BRH Malayalam Extra"/>
-                <w:color w:val="000000"/>
-                <w:sz w:val="32"/>
-                <w:szCs w:val="40"/>
-              </w:rPr>
-              <w:t>-  D</w:t>
-            </w:r>
-            <w:proofErr w:type="gramEnd"/>
+              <w:t>)-  D</w:t>
+            </w:r>
             <w:r>
               <w:rPr>
                 <w:rFonts w:ascii="BRH Malayalam Extra" w:hAnsi="BRH Malayalam Extra" w:cs="BRH Malayalam Extra"/>
@@ -41865,19 +40506,8 @@
                 <w:sz w:val="32"/>
                 <w:szCs w:val="40"/>
               </w:rPr>
-              <w:t>)</w:t>
-            </w:r>
-            <w:proofErr w:type="gramStart"/>
-            <w:r>
-              <w:rPr>
-                <w:rFonts w:ascii="BRH Malayalam Extra" w:hAnsi="BRH Malayalam Extra" w:cs="BRH Malayalam Extra"/>
-                <w:color w:val="000000"/>
-                <w:sz w:val="32"/>
-                <w:szCs w:val="40"/>
-              </w:rPr>
-              <w:t>-  q</w:t>
-            </w:r>
-            <w:proofErr w:type="gramEnd"/>
+              <w:t>)-  q</w:t>
+            </w:r>
             <w:r>
               <w:rPr>
                 <w:rFonts w:ascii="BRH Malayalam Extra" w:hAnsi="BRH Malayalam Extra" w:cs="BRH Malayalam Extra"/>
@@ -42562,19 +41192,8 @@
                 <w:sz w:val="32"/>
                 <w:szCs w:val="40"/>
               </w:rPr>
-              <w:t>)</w:t>
-            </w:r>
-            <w:proofErr w:type="gramStart"/>
-            <w:r>
-              <w:rPr>
-                <w:rFonts w:ascii="BRH Malayalam Extra" w:hAnsi="BRH Malayalam Extra" w:cs="BRH Malayalam Extra"/>
-                <w:color w:val="000000"/>
-                <w:sz w:val="32"/>
-                <w:szCs w:val="40"/>
-              </w:rPr>
-              <w:t>-  D</w:t>
-            </w:r>
-            <w:proofErr w:type="gramEnd"/>
+              <w:t>)-  D</w:t>
+            </w:r>
             <w:r>
               <w:rPr>
                 <w:rFonts w:ascii="BRH Malayalam Extra" w:hAnsi="BRH Malayalam Extra" w:cs="BRH Malayalam Extra"/>
@@ -43101,20 +41720,8 @@
                 <w:szCs w:val="40"/>
                 <w:lang w:val="en-IN"/>
               </w:rPr>
-              <w:t>)</w:t>
-            </w:r>
-            <w:proofErr w:type="gramStart"/>
-            <w:r>
-              <w:rPr>
-                <w:rFonts w:ascii="BRH Malayalam Extra" w:hAnsi="BRH Malayalam Extra" w:cs="BRH Malayalam Extra"/>
-                <w:color w:val="000000"/>
-                <w:sz w:val="32"/>
-                <w:szCs w:val="40"/>
-                <w:lang w:val="en-IN"/>
-              </w:rPr>
-              <w:t>-  q</w:t>
-            </w:r>
-            <w:proofErr w:type="gramEnd"/>
+              <w:t>)-  q</w:t>
+            </w:r>
             <w:r>
               <w:rPr>
                 <w:rFonts w:ascii="BRH Malayalam Extra" w:hAnsi="BRH Malayalam Extra" w:cs="BRH Malayalam Extra"/>
@@ -43826,18 +42433,7 @@
           <w:szCs w:val="32"/>
           <w:u w:val="single"/>
         </w:rPr>
-        <w:t xml:space="preserve">– TS </w:t>
-      </w:r>
-      <w:proofErr w:type="gramStart"/>
-      <w:r>
-        <w:rPr>
-          <w:b/>
-          <w:bCs/>
-          <w:sz w:val="32"/>
-          <w:szCs w:val="32"/>
-          <w:u w:val="single"/>
-        </w:rPr>
-        <w:t>1</w:t>
+        <w:t>– TS 1</w:t>
       </w:r>
       <w:r>
         <w:rPr>
@@ -43869,7 +42465,6 @@
         </w:rPr>
         <w:t xml:space="preserve"> Malayalam</w:t>
       </w:r>
-      <w:proofErr w:type="gramEnd"/>
       <w:r>
         <w:rPr>
           <w:b/>

</xml_diff>